<commit_message>
Match original template branding: embed LYNX/ursa logos and brand palette
- Extract the LYNX (shield) and ursa (bear) logos from the original .doc and
  embed them as a letterhead flanking the title, over an orange rule
- Apply the palette sampled from the logos: ursa teal (#003344) for section
  bars/headings and LYNX orange (#D77B28) accents, with a light-teal label tint
- Keep Calibri body font (matches the template's font set) and the original
  section wording/table structure
- Add image support to the generator (media parts, image relationships,
  png content-type) and optimize the logo PNGs

Co-Authored-By: Claude Opus 4.8 <noreply@anthropic.com>
Claude-Session: https://claude.ai/code/session_01SD8HuFyquyAibx7Xzr6xe4
</commit_message>
<xml_diff>
--- a/ipp-template/IPP_Template_2025-2026.docx
+++ b/ipp-template/IPP_Template_2025-2026.docx
@@ -2,67 +2,207 @@
 <file path=word/document.xml><?xml version="1.0" encoding="utf-8"?>
 <w:document xmlns:w="http://schemas.openxmlformats.org/wordprocessingml/2006/main" xmlns:r="http://schemas.openxmlformats.org/officeDocument/2006/relationships" xmlns:w14="http://schemas.microsoft.com/office/word/2010/wordml" xmlns:mc="http://schemas.openxmlformats.org/markup-compatibility/2006" mc:Ignorable="w14">
   <w:body>
+    <w:tbl>
+      <w:tblPr>
+        <w:tblW w:w="10080" w:type="dxa"/>
+        <w:tblBorders>
+          <w:top w:val="none" w:sz="0" w:space="0" w:color="auto"/>
+          <w:left w:val="none" w:sz="0" w:space="0" w:color="auto"/>
+          <w:bottom w:val="none" w:sz="0" w:space="0" w:color="auto"/>
+          <w:right w:val="none" w:sz="0" w:space="0" w:color="auto"/>
+          <w:insideH w:val="none" w:sz="0" w:space="0" w:color="auto"/>
+          <w:insideV w:val="none" w:sz="0" w:space="0" w:color="auto"/>
+        </w:tblBorders>
+        <w:tblLook w:val="0000" w:firstRow="0" w:lastRow="0" w:firstColumn="0" w:lastColumn="0" w:noHBand="1" w:noVBand="1"/>
+      </w:tblPr>
+      <w:tblGrid>
+        <w:gridCol w:w="2200"/>
+        <w:gridCol w:w="5680"/>
+        <w:gridCol w:w="2200"/>
+      </w:tblGrid>
+      <w:tr>
+        <w:tc>
+          <w:tcPr>
+            <w:tcW w:w="2200" w:type="dxa"/>
+            <w:vAlign w:val="center"/>
+          </w:tcPr>
+          <w:p>
+            <w:pPr>
+              <w:spacing w:before="0" w:after="0" w:line="240" w:lineRule="auto"/>
+              <w:jc w:val="left"/>
+            </w:pPr>
+            <w:r>
+              <w:rPr>
+                <w:noProof/>
+              </w:rPr>
+              <w:drawing>
+                <wp:inline xmlns:wp="http://schemas.openxmlformats.org/drawingml/2006/wordprocessingDrawing" distT="0" distB="0" distL="0" distR="0">
+                  <wp:extent cx="531266" cy="640080"/>
+                  <wp:effectExtent l="0" t="0" r="0" b="0"/>
+                  <wp:docPr id="1001" name="LYNX logo"/>
+                  <wp:cNvGraphicFramePr>
+                    <a:graphicFrameLocks xmlns:a="http://schemas.openxmlformats.org/drawingml/2006/main" noChangeAspect="1"/>
+                  </wp:cNvGraphicFramePr>
+                  <a:graphic xmlns:a="http://schemas.openxmlformats.org/drawingml/2006/main">
+                    <a:graphicData uri="http://schemas.openxmlformats.org/drawingml/2006/picture">
+                      <pic:pic xmlns:pic="http://schemas.openxmlformats.org/drawingml/2006/picture">
+                        <pic:nvPicPr>
+                          <pic:cNvPr id="1001" name="LYNX logo"/>
+                          <pic:cNvPicPr/>
+                        </pic:nvPicPr>
+                        <pic:blipFill>
+                          <a:blip r:embed="rIdLynx"/>
+                          <a:stretch>
+                            <a:fillRect/>
+                          </a:stretch>
+                        </pic:blipFill>
+                        <pic:spPr>
+                          <a:xfrm>
+                            <a:off x="0" y="0"/>
+                            <a:ext cx="531266" cy="640080"/>
+                          </a:xfrm>
+                          <a:prstGeom prst="rect">
+                            <a:avLst/>
+                          </a:prstGeom>
+                        </pic:spPr>
+                      </pic:pic>
+                    </a:graphicData>
+                  </a:graphic>
+                </wp:inline>
+              </w:drawing>
+            </w:r>
+          </w:p>
+        </w:tc>
+        <w:tc>
+          <w:tcPr>
+            <w:tcW w:w="5680" w:type="dxa"/>
+            <w:vAlign w:val="center"/>
+          </w:tcPr>
+          <w:p>
+            <w:pPr>
+              <w:spacing w:before="0" w:after="20" w:line="240" w:lineRule="auto"/>
+              <w:jc w:val="center"/>
+            </w:pPr>
+            <w:r>
+              <w:rPr>
+                <w:b/>
+                <w:color w:val="003344"/>
+                <w:sz w:val="40"/>
+                <w:szCs w:val="40"/>
+              </w:rPr>
+              <w:t xml:space="preserve">Individualized Program Plan</w:t>
+            </w:r>
+          </w:p>
+          <w:p>
+            <w:pPr>
+              <w:spacing w:before="0" w:after="20" w:line="240" w:lineRule="auto"/>
+              <w:jc w:val="center"/>
+            </w:pPr>
+            <w:r>
+              <w:rPr>
+                <w:b/>
+                <w:color w:val="D77B28"/>
+                <w:sz w:val="24"/>
+                <w:szCs w:val="24"/>
+              </w:rPr>
+              <w:t xml:space="preserve">LYNX / ursa</w:t>
+            </w:r>
+            <w:r>
+              <w:rPr>
+                <w:color w:val="595959"/>
+                <w:sz w:val="22"/>
+                <w:szCs w:val="22"/>
+              </w:rPr>
+              <w:t xml:space="preserve">     •     2025–2026</w:t>
+            </w:r>
+          </w:p>
+          <w:p>
+            <w:pPr>
+              <w:spacing w:before="0" w:after="0" w:line="240" w:lineRule="auto"/>
+              <w:jc w:val="center"/>
+            </w:pPr>
+            <w:r>
+              <w:rPr>
+                <w:i/>
+                <w:color w:val="595959"/>
+                <w:sz w:val="18"/>
+                <w:szCs w:val="18"/>
+              </w:rPr>
+              <w:t xml:space="preserve">Alberta Education – Special Education / Inclusive Education</w:t>
+            </w:r>
+          </w:p>
+        </w:tc>
+        <w:tc>
+          <w:tcPr>
+            <w:tcW w:w="2200" w:type="dxa"/>
+            <w:vAlign w:val="center"/>
+          </w:tcPr>
+          <w:p>
+            <w:pPr>
+              <w:spacing w:before="0" w:after="0" w:line="240" w:lineRule="auto"/>
+              <w:jc w:val="right"/>
+            </w:pPr>
+            <w:r>
+              <w:rPr>
+                <w:noProof/>
+              </w:rPr>
+              <w:drawing>
+                <wp:inline xmlns:wp="http://schemas.openxmlformats.org/drawingml/2006/wordprocessingDrawing" distT="0" distB="0" distL="0" distR="0">
+                  <wp:extent cx="797384" cy="548640"/>
+                  <wp:effectExtent l="0" t="0" r="0" b="0"/>
+                  <wp:docPr id="1002" name="ursa logo"/>
+                  <wp:cNvGraphicFramePr>
+                    <a:graphicFrameLocks xmlns:a="http://schemas.openxmlformats.org/drawingml/2006/main" noChangeAspect="1"/>
+                  </wp:cNvGraphicFramePr>
+                  <a:graphic xmlns:a="http://schemas.openxmlformats.org/drawingml/2006/main">
+                    <a:graphicData uri="http://schemas.openxmlformats.org/drawingml/2006/picture">
+                      <pic:pic xmlns:pic="http://schemas.openxmlformats.org/drawingml/2006/picture">
+                        <pic:nvPicPr>
+                          <pic:cNvPr id="1002" name="ursa logo"/>
+                          <pic:cNvPicPr/>
+                        </pic:nvPicPr>
+                        <pic:blipFill>
+                          <a:blip r:embed="rIdUrsa"/>
+                          <a:stretch>
+                            <a:fillRect/>
+                          </a:stretch>
+                        </pic:blipFill>
+                        <pic:spPr>
+                          <a:xfrm>
+                            <a:off x="0" y="0"/>
+                            <a:ext cx="797384" cy="548640"/>
+                          </a:xfrm>
+                          <a:prstGeom prst="rect">
+                            <a:avLst/>
+                          </a:prstGeom>
+                        </pic:spPr>
+                      </pic:pic>
+                    </a:graphicData>
+                  </a:graphic>
+                </wp:inline>
+              </w:drawing>
+            </w:r>
+          </w:p>
+        </w:tc>
+      </w:tr>
+    </w:tbl>
     <w:p>
       <w:pPr>
-        <w:spacing w:before="0" w:after="40" w:line="240" w:lineRule="auto"/>
-        <w:jc w:val="center"/>
+        <w:pBdr>
+          <w:bottom w:val="single" w:sz="18" w:space="1" w:color="D77B28"/>
+        </w:pBdr>
+        <w:spacing w:before="0" w:after="120"/>
       </w:pPr>
-      <w:r>
-        <w:rPr>
-          <w:b/>
-          <w:color w:val="2E5A87"/>
-          <w:sz w:val="40"/>
-          <w:szCs w:val="40"/>
-        </w:rPr>
-        <w:t xml:space="preserve">Individualized Program Plan</w:t>
-      </w:r>
     </w:p>
     <w:p>
       <w:pPr>
-        <w:spacing w:before="0" w:after="40" w:line="240" w:lineRule="auto"/>
-        <w:jc w:val="center"/>
-      </w:pPr>
-      <w:r>
-        <w:rPr>
-          <w:b/>
-          <w:color w:val="595959"/>
-          <w:sz w:val="26"/>
-          <w:szCs w:val="26"/>
-        </w:rPr>
-        <w:t xml:space="preserve">LYNX / ursa</w:t>
-      </w:r>
-      <w:r>
-        <w:rPr>
-          <w:color w:val="595959"/>
-          <w:sz w:val="24"/>
-          <w:szCs w:val="24"/>
-        </w:rPr>
-        <w:t xml:space="preserve">     •     2025–2026</w:t>
-      </w:r>
-    </w:p>
-    <w:p>
-      <w:pPr>
-        <w:spacing w:before="0" w:after="120" w:line="240" w:lineRule="auto"/>
-        <w:jc w:val="center"/>
-      </w:pPr>
-      <w:r>
-        <w:rPr>
-          <w:i/>
-          <w:color w:val="595959"/>
-          <w:sz w:val="18"/>
-          <w:szCs w:val="18"/>
-        </w:rPr>
-        <w:t xml:space="preserve">Alberta Education – Special Education / Inclusive Education</w:t>
-      </w:r>
-    </w:p>
-    <w:p>
-      <w:pPr>
-        <w:shd w:val="clear" w:color="auto" w:fill="EEF3F9"/>
+        <w:shd w:val="clear" w:color="auto" w:fill="DCE6EA"/>
         <w:spacing w:before="60" w:after="60" w:line="240" w:lineRule="auto"/>
       </w:pPr>
       <w:r>
         <w:rPr>
           <w:b/>
+          <w:color w:val="003344"/>
           <w:sz w:val="22"/>
           <w:szCs w:val="22"/>
         </w:rPr>
@@ -75,7 +215,7 @@
           </w:rPr>
           <w:alias w:val="Reporting Period"/>
           <w:tag w:val="Reporting Period"/>
-          <w:id w:val="1001"/>
+          <w:id w:val="1003"/>
           <w:placeholder>
             <w:docPart w:val="DefaultPlaceholder_-1854013440"/>
           </w:placeholder>
@@ -99,6 +239,7 @@
       <w:r>
         <w:rPr>
           <w:b/>
+          <w:color w:val="003344"/>
           <w:sz w:val="22"/>
           <w:szCs w:val="22"/>
         </w:rPr>
@@ -111,7 +252,7 @@
           </w:rPr>
           <w:alias w:val="Date Updated"/>
           <w:tag w:val="Date Updated"/>
-          <w:id w:val="1002"/>
+          <w:id w:val="1004"/>
           <w:placeholder>
             <w:docPart w:val="DefaultPlaceholder_-1854013440"/>
           </w:placeholder>
@@ -158,8 +299,8 @@
     </w:p>
     <w:p>
       <w:pPr>
-        <w:shd w:val="clear" w:color="auto" w:fill="2E5A87"/>
-        <w:spacing w:before="120" w:after="60" w:line="240" w:lineRule="auto"/>
+        <w:shd w:val="clear" w:color="auto" w:fill="003344"/>
+        <w:spacing w:before="140" w:after="60" w:line="240" w:lineRule="auto"/>
       </w:pPr>
       <w:r>
         <w:rPr>
@@ -198,7 +339,7 @@
         <w:tc>
           <w:tcPr>
             <w:tcW w:w="3600" w:type="dxa"/>
-            <w:shd w:val="clear" w:color="auto" w:fill="DCE6F1"/>
+            <w:shd w:val="clear" w:color="auto" w:fill="DCE6EA"/>
             <w:vAlign w:val="top"/>
           </w:tcPr>
           <w:p>
@@ -208,6 +349,7 @@
             <w:r>
               <w:rPr>
                 <w:b/>
+                <w:color w:val="003344"/>
                 <w:sz w:val="20"/>
                 <w:szCs w:val="20"/>
               </w:rPr>
@@ -231,7 +373,7 @@
                 </w:rPr>
                 <w:alias w:val="Student Name"/>
                 <w:tag w:val="Student Name"/>
-                <w:id w:val="1003"/>
+                <w:id w:val="1005"/>
                 <w:placeholder>
                   <w:docPart w:val="DefaultPlaceholder_-1854013440"/>
                 </w:placeholder>
@@ -254,7 +396,7 @@
         <w:tc>
           <w:tcPr>
             <w:tcW w:w="3600" w:type="dxa"/>
-            <w:shd w:val="clear" w:color="auto" w:fill="DCE6F1"/>
+            <w:shd w:val="clear" w:color="auto" w:fill="DCE6EA"/>
             <w:vAlign w:val="top"/>
           </w:tcPr>
           <w:p>
@@ -264,6 +406,7 @@
             <w:r>
               <w:rPr>
                 <w:b/>
+                <w:color w:val="003344"/>
                 <w:sz w:val="20"/>
                 <w:szCs w:val="20"/>
               </w:rPr>
@@ -287,7 +430,7 @@
                 </w:rPr>
                 <w:alias w:val="Date of Birth"/>
                 <w:tag w:val="Date of Birth"/>
-                <w:id w:val="1004"/>
+                <w:id w:val="1006"/>
                 <w:placeholder>
                   <w:docPart w:val="DefaultPlaceholder_-1854013440"/>
                 </w:placeholder>
@@ -310,7 +453,7 @@
         <w:tc>
           <w:tcPr>
             <w:tcW w:w="3600" w:type="dxa"/>
-            <w:shd w:val="clear" w:color="auto" w:fill="DCE6F1"/>
+            <w:shd w:val="clear" w:color="auto" w:fill="DCE6EA"/>
             <w:vAlign w:val="top"/>
           </w:tcPr>
           <w:p>
@@ -320,6 +463,7 @@
             <w:r>
               <w:rPr>
                 <w:b/>
+                <w:color w:val="003344"/>
                 <w:sz w:val="20"/>
                 <w:szCs w:val="20"/>
               </w:rPr>
@@ -343,7 +487,7 @@
                 </w:rPr>
                 <w:alias w:val="ASN"/>
                 <w:tag w:val="ASN"/>
-                <w:id w:val="1005"/>
+                <w:id w:val="1007"/>
                 <w:placeholder>
                   <w:docPart w:val="DefaultPlaceholder_-1854013440"/>
                 </w:placeholder>
@@ -366,7 +510,7 @@
         <w:tc>
           <w:tcPr>
             <w:tcW w:w="3600" w:type="dxa"/>
-            <w:shd w:val="clear" w:color="auto" w:fill="DCE6F1"/>
+            <w:shd w:val="clear" w:color="auto" w:fill="DCE6EA"/>
             <w:vAlign w:val="top"/>
           </w:tcPr>
           <w:p>
@@ -376,6 +520,7 @@
             <w:r>
               <w:rPr>
                 <w:b/>
+                <w:color w:val="003344"/>
                 <w:sz w:val="20"/>
                 <w:szCs w:val="20"/>
               </w:rPr>
@@ -399,7 +544,7 @@
                 </w:rPr>
                 <w:alias w:val="Gender"/>
                 <w:tag w:val="Gender"/>
-                <w:id w:val="1006"/>
+                <w:id w:val="1008"/>
                 <w:placeholder>
                   <w:docPart w:val="DefaultPlaceholder_-1854013440"/>
                 </w:placeholder>
@@ -422,7 +567,7 @@
         <w:tc>
           <w:tcPr>
             <w:tcW w:w="3600" w:type="dxa"/>
-            <w:shd w:val="clear" w:color="auto" w:fill="DCE6F1"/>
+            <w:shd w:val="clear" w:color="auto" w:fill="DCE6EA"/>
             <w:vAlign w:val="top"/>
           </w:tcPr>
           <w:p>
@@ -432,6 +577,7 @@
             <w:r>
               <w:rPr>
                 <w:b/>
+                <w:color w:val="003344"/>
                 <w:sz w:val="20"/>
                 <w:szCs w:val="20"/>
               </w:rPr>
@@ -455,7 +601,7 @@
                 </w:rPr>
                 <w:alias w:val="Grade/Learning Group"/>
                 <w:tag w:val="Grade/Learning Group"/>
-                <w:id w:val="1007"/>
+                <w:id w:val="1009"/>
                 <w:placeholder>
                   <w:docPart w:val="DefaultPlaceholder_-1854013440"/>
                 </w:placeholder>
@@ -478,7 +624,7 @@
         <w:tc>
           <w:tcPr>
             <w:tcW w:w="3600" w:type="dxa"/>
-            <w:shd w:val="clear" w:color="auto" w:fill="DCE6F1"/>
+            <w:shd w:val="clear" w:color="auto" w:fill="DCE6EA"/>
             <w:vAlign w:val="top"/>
           </w:tcPr>
           <w:p>
@@ -488,6 +634,7 @@
             <w:r>
               <w:rPr>
                 <w:b/>
+                <w:color w:val="003344"/>
                 <w:sz w:val="20"/>
                 <w:szCs w:val="20"/>
               </w:rPr>
@@ -511,7 +658,7 @@
                 </w:rPr>
                 <w:alias w:val="Parent/Guardian"/>
                 <w:tag w:val="Parent/Guardian"/>
-                <w:id w:val="1008"/>
+                <w:id w:val="1010"/>
                 <w:placeholder>
                   <w:docPart w:val="DefaultPlaceholder_-1854013440"/>
                 </w:placeholder>
@@ -534,7 +681,7 @@
         <w:tc>
           <w:tcPr>
             <w:tcW w:w="3600" w:type="dxa"/>
-            <w:shd w:val="clear" w:color="auto" w:fill="DCE6F1"/>
+            <w:shd w:val="clear" w:color="auto" w:fill="DCE6EA"/>
             <w:vAlign w:val="top"/>
           </w:tcPr>
           <w:p>
@@ -544,6 +691,7 @@
             <w:r>
               <w:rPr>
                 <w:b/>
+                <w:color w:val="003344"/>
                 <w:sz w:val="20"/>
                 <w:szCs w:val="20"/>
               </w:rPr>
@@ -567,7 +715,7 @@
                 </w:rPr>
                 <w:alias w:val="Address Line 1"/>
                 <w:tag w:val="Address Line 1"/>
-                <w:id w:val="1009"/>
+                <w:id w:val="1011"/>
                 <w:placeholder>
                   <w:docPart w:val="DefaultPlaceholder_-1854013440"/>
                 </w:placeholder>
@@ -590,7 +738,7 @@
         <w:tc>
           <w:tcPr>
             <w:tcW w:w="3600" w:type="dxa"/>
-            <w:shd w:val="clear" w:color="auto" w:fill="DCE6F1"/>
+            <w:shd w:val="clear" w:color="auto" w:fill="DCE6EA"/>
             <w:vAlign w:val="top"/>
           </w:tcPr>
           <w:p>
@@ -600,6 +748,7 @@
             <w:r>
               <w:rPr>
                 <w:b/>
+                <w:color w:val="003344"/>
                 <w:sz w:val="20"/>
                 <w:szCs w:val="20"/>
               </w:rPr>
@@ -623,7 +772,7 @@
                 </w:rPr>
                 <w:alias w:val="Address Line 2"/>
                 <w:tag w:val="Address Line 2"/>
-                <w:id w:val="1010"/>
+                <w:id w:val="1012"/>
                 <w:placeholder>
                   <w:docPart w:val="DefaultPlaceholder_-1854013440"/>
                 </w:placeholder>
@@ -646,7 +795,7 @@
         <w:tc>
           <w:tcPr>
             <w:tcW w:w="3600" w:type="dxa"/>
-            <w:shd w:val="clear" w:color="auto" w:fill="DCE6F1"/>
+            <w:shd w:val="clear" w:color="auto" w:fill="DCE6EA"/>
             <w:vAlign w:val="top"/>
           </w:tcPr>
           <w:p>
@@ -656,6 +805,7 @@
             <w:r>
               <w:rPr>
                 <w:b/>
+                <w:color w:val="003344"/>
                 <w:sz w:val="20"/>
                 <w:szCs w:val="20"/>
               </w:rPr>
@@ -679,7 +829,7 @@
                 </w:rPr>
                 <w:alias w:val="Telephone Home"/>
                 <w:tag w:val="Telephone Home"/>
-                <w:id w:val="1011"/>
+                <w:id w:val="1013"/>
                 <w:placeholder>
                   <w:docPart w:val="DefaultPlaceholder_-1854013440"/>
                 </w:placeholder>
@@ -702,7 +852,7 @@
         <w:tc>
           <w:tcPr>
             <w:tcW w:w="3600" w:type="dxa"/>
-            <w:shd w:val="clear" w:color="auto" w:fill="DCE6F1"/>
+            <w:shd w:val="clear" w:color="auto" w:fill="DCE6EA"/>
             <w:vAlign w:val="top"/>
           </w:tcPr>
           <w:p>
@@ -712,6 +862,7 @@
             <w:r>
               <w:rPr>
                 <w:b/>
+                <w:color w:val="003344"/>
                 <w:sz w:val="20"/>
                 <w:szCs w:val="20"/>
               </w:rPr>
@@ -735,7 +886,7 @@
                 </w:rPr>
                 <w:alias w:val="Telephone Cell Father"/>
                 <w:tag w:val="Telephone Cell Father"/>
-                <w:id w:val="1012"/>
+                <w:id w:val="1014"/>
                 <w:placeholder>
                   <w:docPart w:val="DefaultPlaceholder_-1854013440"/>
                 </w:placeholder>
@@ -758,7 +909,7 @@
         <w:tc>
           <w:tcPr>
             <w:tcW w:w="3600" w:type="dxa"/>
-            <w:shd w:val="clear" w:color="auto" w:fill="DCE6F1"/>
+            <w:shd w:val="clear" w:color="auto" w:fill="DCE6EA"/>
             <w:vAlign w:val="top"/>
           </w:tcPr>
           <w:p>
@@ -768,6 +919,7 @@
             <w:r>
               <w:rPr>
                 <w:b/>
+                <w:color w:val="003344"/>
                 <w:sz w:val="20"/>
                 <w:szCs w:val="20"/>
               </w:rPr>
@@ -791,7 +943,7 @@
                 </w:rPr>
                 <w:alias w:val="Telephone Cell Mother"/>
                 <w:tag w:val="Telephone Cell Mother"/>
-                <w:id w:val="1013"/>
+                <w:id w:val="1015"/>
                 <w:placeholder>
                   <w:docPart w:val="DefaultPlaceholder_-1854013440"/>
                 </w:placeholder>
@@ -814,7 +966,7 @@
         <w:tc>
           <w:tcPr>
             <w:tcW w:w="3600" w:type="dxa"/>
-            <w:shd w:val="clear" w:color="auto" w:fill="DCE6F1"/>
+            <w:shd w:val="clear" w:color="auto" w:fill="DCE6EA"/>
             <w:vAlign w:val="top"/>
           </w:tcPr>
           <w:p>
@@ -824,6 +976,7 @@
             <w:r>
               <w:rPr>
                 <w:b/>
+                <w:color w:val="003344"/>
                 <w:sz w:val="20"/>
                 <w:szCs w:val="20"/>
               </w:rPr>
@@ -847,7 +1000,7 @@
                 </w:rPr>
                 <w:alias w:val="Email Student"/>
                 <w:tag w:val="Email Student"/>
-                <w:id w:val="1014"/>
+                <w:id w:val="1016"/>
                 <w:placeholder>
                   <w:docPart w:val="DefaultPlaceholder_-1854013440"/>
                 </w:placeholder>
@@ -870,7 +1023,7 @@
         <w:tc>
           <w:tcPr>
             <w:tcW w:w="3600" w:type="dxa"/>
-            <w:shd w:val="clear" w:color="auto" w:fill="DCE6F1"/>
+            <w:shd w:val="clear" w:color="auto" w:fill="DCE6EA"/>
             <w:vAlign w:val="top"/>
           </w:tcPr>
           <w:p>
@@ -880,6 +1033,7 @@
             <w:r>
               <w:rPr>
                 <w:b/>
+                <w:color w:val="003344"/>
                 <w:sz w:val="20"/>
                 <w:szCs w:val="20"/>
               </w:rPr>
@@ -903,7 +1057,7 @@
                 </w:rPr>
                 <w:alias w:val="Email Father"/>
                 <w:tag w:val="Email Father"/>
-                <w:id w:val="1015"/>
+                <w:id w:val="1017"/>
                 <w:placeholder>
                   <w:docPart w:val="DefaultPlaceholder_-1854013440"/>
                 </w:placeholder>
@@ -926,7 +1080,7 @@
         <w:tc>
           <w:tcPr>
             <w:tcW w:w="3600" w:type="dxa"/>
-            <w:shd w:val="clear" w:color="auto" w:fill="DCE6F1"/>
+            <w:shd w:val="clear" w:color="auto" w:fill="DCE6EA"/>
             <w:vAlign w:val="top"/>
           </w:tcPr>
           <w:p>
@@ -936,6 +1090,7 @@
             <w:r>
               <w:rPr>
                 <w:b/>
+                <w:color w:val="003344"/>
                 <w:sz w:val="20"/>
                 <w:szCs w:val="20"/>
               </w:rPr>
@@ -959,7 +1114,7 @@
                 </w:rPr>
                 <w:alias w:val="Email Mother"/>
                 <w:tag w:val="Email Mother"/>
-                <w:id w:val="1016"/>
+                <w:id w:val="1018"/>
                 <w:placeholder>
                   <w:docPart w:val="DefaultPlaceholder_-1854013440"/>
                 </w:placeholder>
@@ -982,7 +1137,7 @@
         <w:tc>
           <w:tcPr>
             <w:tcW w:w="3600" w:type="dxa"/>
-            <w:shd w:val="clear" w:color="auto" w:fill="DCE6F1"/>
+            <w:shd w:val="clear" w:color="auto" w:fill="DCE6EA"/>
             <w:vAlign w:val="top"/>
           </w:tcPr>
           <w:p>
@@ -992,6 +1147,7 @@
             <w:r>
               <w:rPr>
                 <w:b/>
+                <w:color w:val="003344"/>
                 <w:sz w:val="20"/>
                 <w:szCs w:val="20"/>
               </w:rPr>
@@ -1015,7 +1171,7 @@
                 </w:rPr>
                 <w:alias w:val="Alberta Education Code"/>
                 <w:tag w:val="Alberta Education Code"/>
-                <w:id w:val="1017"/>
+                <w:id w:val="1019"/>
                 <w:placeholder>
                   <w:docPart w:val="DefaultPlaceholder_-1854013440"/>
                 </w:placeholder>
@@ -1058,7 +1214,7 @@
       <w:pPr>
         <w:spacing w:before="0" w:after="40" w:line="240" w:lineRule="auto"/>
       </w:pPr>
-      <w:hyperlink r:id="rHl1018">
+      <w:hyperlink r:id="rHl1020">
         <w:r>
           <w:rPr>
             <w:rStyle w:val="Hyperlink"/>
@@ -1072,7 +1228,7 @@
       <w:pPr>
         <w:spacing w:before="0" w:after="80" w:line="240" w:lineRule="auto"/>
       </w:pPr>
-      <w:hyperlink r:id="rHl1019">
+      <w:hyperlink r:id="rHl1021">
         <w:r>
           <w:rPr>
             <w:rStyle w:val="Hyperlink"/>
@@ -1084,8 +1240,8 @@
     </w:p>
     <w:p>
       <w:pPr>
-        <w:shd w:val="clear" w:color="auto" w:fill="2E5A87"/>
-        <w:spacing w:before="120" w:after="60" w:line="240" w:lineRule="auto"/>
+        <w:shd w:val="clear" w:color="auto" w:fill="003344"/>
+        <w:spacing w:before="140" w:after="60" w:line="240" w:lineRule="auto"/>
       </w:pPr>
       <w:r>
         <w:rPr>
@@ -1124,7 +1280,7 @@
         <w:tc>
           <w:tcPr>
             <w:tcW w:w="3600" w:type="dxa"/>
-            <w:shd w:val="clear" w:color="auto" w:fill="DCE6F1"/>
+            <w:shd w:val="clear" w:color="auto" w:fill="DCE6EA"/>
             <w:vAlign w:val="top"/>
           </w:tcPr>
           <w:p>
@@ -1134,6 +1290,7 @@
             <w:r>
               <w:rPr>
                 <w:b/>
+                <w:color w:val="003344"/>
                 <w:sz w:val="20"/>
                 <w:szCs w:val="20"/>
               </w:rPr>
@@ -1157,7 +1314,7 @@
                 </w:rPr>
                 <w:alias w:val="Relevant Medical Information"/>
                 <w:tag w:val="Relevant Medical Information"/>
-                <w:id w:val="1020"/>
+                <w:id w:val="1022"/>
                 <w:placeholder>
                   <w:docPart w:val="DefaultPlaceholder_-1854013440"/>
                 </w:placeholder>
@@ -1180,7 +1337,7 @@
         <w:tc>
           <w:tcPr>
             <w:tcW w:w="3600" w:type="dxa"/>
-            <w:shd w:val="clear" w:color="auto" w:fill="DCE6F1"/>
+            <w:shd w:val="clear" w:color="auto" w:fill="DCE6EA"/>
             <w:vAlign w:val="top"/>
           </w:tcPr>
           <w:p>
@@ -1190,6 +1347,7 @@
             <w:r>
               <w:rPr>
                 <w:b/>
+                <w:color w:val="003344"/>
                 <w:sz w:val="20"/>
                 <w:szCs w:val="20"/>
               </w:rPr>
@@ -1213,7 +1371,7 @@
                 </w:rPr>
                 <w:alias w:val="Medications"/>
                 <w:tag w:val="Medications"/>
-                <w:id w:val="1021"/>
+                <w:id w:val="1023"/>
                 <w:placeholder>
                   <w:docPart w:val="DefaultPlaceholder_-1854013440"/>
                 </w:placeholder>
@@ -1240,8 +1398,8 @@
     </w:p>
     <w:p>
       <w:pPr>
-        <w:shd w:val="clear" w:color="auto" w:fill="2E5A87"/>
-        <w:spacing w:before="120" w:after="60" w:line="240" w:lineRule="auto"/>
+        <w:shd w:val="clear" w:color="auto" w:fill="003344"/>
+        <w:spacing w:before="140" w:after="60" w:line="240" w:lineRule="auto"/>
       </w:pPr>
       <w:r>
         <w:rPr>
@@ -1284,7 +1442,7 @@
         <w:tc>
           <w:tcPr>
             <w:tcW w:w="3400" w:type="dxa"/>
-            <w:shd w:val="clear" w:color="auto" w:fill="DCE6F1"/>
+            <w:shd w:val="clear" w:color="auto" w:fill="DCE6EA"/>
             <w:vAlign w:val="top"/>
           </w:tcPr>
           <w:p>
@@ -1294,6 +1452,7 @@
             <w:r>
               <w:rPr>
                 <w:b/>
+                <w:color w:val="003344"/>
                 <w:sz w:val="20"/>
                 <w:szCs w:val="20"/>
               </w:rPr>
@@ -1304,7 +1463,7 @@
         <w:tc>
           <w:tcPr>
             <w:tcW w:w="3340" w:type="dxa"/>
-            <w:shd w:val="clear" w:color="auto" w:fill="DCE6F1"/>
+            <w:shd w:val="clear" w:color="auto" w:fill="DCE6EA"/>
             <w:vAlign w:val="top"/>
           </w:tcPr>
           <w:p>
@@ -1314,6 +1473,7 @@
             <w:r>
               <w:rPr>
                 <w:b/>
+                <w:color w:val="003344"/>
                 <w:sz w:val="20"/>
                 <w:szCs w:val="20"/>
               </w:rPr>
@@ -1324,7 +1484,7 @@
         <w:tc>
           <w:tcPr>
             <w:tcW w:w="3340" w:type="dxa"/>
-            <w:shd w:val="clear" w:color="auto" w:fill="DCE6F1"/>
+            <w:shd w:val="clear" w:color="auto" w:fill="DCE6EA"/>
             <w:vAlign w:val="top"/>
           </w:tcPr>
           <w:p>
@@ -1334,6 +1494,7 @@
             <w:r>
               <w:rPr>
                 <w:b/>
+                <w:color w:val="003344"/>
                 <w:sz w:val="20"/>
                 <w:szCs w:val="20"/>
               </w:rPr>
@@ -1377,7 +1538,7 @@
                 </w:rPr>
                 <w:alias w:val="Individual Responsible"/>
                 <w:tag w:val="Individual Responsible"/>
-                <w:id w:val="1022"/>
+                <w:id w:val="1024"/>
                 <w:placeholder>
                   <w:docPart w:val="DefaultPlaceholder_-1854013440"/>
                 </w:placeholder>
@@ -1411,7 +1572,7 @@
                 </w:rPr>
                 <w:alias w:val="Delivery"/>
                 <w:tag w:val="Delivery"/>
-                <w:id w:val="1023"/>
+                <w:id w:val="1025"/>
                 <w:placeholder>
                   <w:docPart w:val="DefaultPlaceholder_-1854013440"/>
                 </w:placeholder>
@@ -1470,7 +1631,7 @@
                 </w:rPr>
                 <w:alias w:val="Individual Responsible"/>
                 <w:tag w:val="Individual Responsible"/>
-                <w:id w:val="1024"/>
+                <w:id w:val="1026"/>
                 <w:placeholder>
                   <w:docPart w:val="DefaultPlaceholder_-1854013440"/>
                 </w:placeholder>
@@ -1504,7 +1665,7 @@
                 </w:rPr>
                 <w:alias w:val="Delivery"/>
                 <w:tag w:val="Delivery"/>
-                <w:id w:val="1025"/>
+                <w:id w:val="1027"/>
                 <w:placeholder>
                   <w:docPart w:val="DefaultPlaceholder_-1854013440"/>
                 </w:placeholder>
@@ -1563,7 +1724,7 @@
                 </w:rPr>
                 <w:alias w:val="Individual Responsible"/>
                 <w:tag w:val="Individual Responsible"/>
-                <w:id w:val="1026"/>
+                <w:id w:val="1028"/>
                 <w:placeholder>
                   <w:docPart w:val="DefaultPlaceholder_-1854013440"/>
                 </w:placeholder>
@@ -1597,7 +1758,7 @@
                 </w:rPr>
                 <w:alias w:val="Delivery"/>
                 <w:tag w:val="Delivery"/>
-                <w:id w:val="1027"/>
+                <w:id w:val="1029"/>
                 <w:placeholder>
                   <w:docPart w:val="DefaultPlaceholder_-1854013440"/>
                 </w:placeholder>
@@ -1656,7 +1817,7 @@
                 </w:rPr>
                 <w:alias w:val="Individual Responsible"/>
                 <w:tag w:val="Individual Responsible"/>
-                <w:id w:val="1028"/>
+                <w:id w:val="1030"/>
                 <w:placeholder>
                   <w:docPart w:val="DefaultPlaceholder_-1854013440"/>
                 </w:placeholder>
@@ -1690,7 +1851,7 @@
                 </w:rPr>
                 <w:alias w:val="Delivery"/>
                 <w:tag w:val="Delivery"/>
-                <w:id w:val="1029"/>
+                <w:id w:val="1031"/>
                 <w:placeholder>
                   <w:docPart w:val="DefaultPlaceholder_-1854013440"/>
                 </w:placeholder>
@@ -1722,8 +1883,8 @@
     </w:p>
     <w:p>
       <w:pPr>
-        <w:shd w:val="clear" w:color="auto" w:fill="2E5A87"/>
-        <w:spacing w:before="120" w:after="60" w:line="240" w:lineRule="auto"/>
+        <w:shd w:val="clear" w:color="auto" w:fill="003344"/>
+        <w:spacing w:before="140" w:after="60" w:line="240" w:lineRule="auto"/>
       </w:pPr>
       <w:r>
         <w:rPr>
@@ -1765,7 +1926,7 @@
         <w:tc>
           <w:tcPr>
             <w:tcW w:w="5040" w:type="dxa"/>
-            <w:shd w:val="clear" w:color="auto" w:fill="DCE6F1"/>
+            <w:shd w:val="clear" w:color="auto" w:fill="DCE6EA"/>
             <w:vAlign w:val="top"/>
           </w:tcPr>
           <w:p>
@@ -1775,6 +1936,7 @@
             <w:r>
               <w:rPr>
                 <w:b/>
+                <w:color w:val="003344"/>
                 <w:sz w:val="20"/>
                 <w:szCs w:val="20"/>
               </w:rPr>
@@ -1785,7 +1947,7 @@
         <w:tc>
           <w:tcPr>
             <w:tcW w:w="5040" w:type="dxa"/>
-            <w:shd w:val="clear" w:color="auto" w:fill="DCE6F1"/>
+            <w:shd w:val="clear" w:color="auto" w:fill="DCE6EA"/>
             <w:vAlign w:val="top"/>
           </w:tcPr>
           <w:p>
@@ -1795,81 +1957,12 @@
             <w:r>
               <w:rPr>
                 <w:b/>
+                <w:color w:val="003344"/>
                 <w:sz w:val="20"/>
                 <w:szCs w:val="20"/>
               </w:rPr>
               <w:t xml:space="preserve">Year(s) Attended</w:t>
             </w:r>
-          </w:p>
-        </w:tc>
-      </w:tr>
-      <w:tr>
-        <w:tc>
-          <w:tcPr>
-            <w:tcW w:w="5040" w:type="dxa"/>
-            <w:vAlign w:val="top"/>
-          </w:tcPr>
-          <w:p>
-            <w:pPr>
-              <w:spacing w:before="0" w:after="60" w:line="240" w:lineRule="auto"/>
-            </w:pPr>
-            <w:sdt>
-              <w:sdtPr>
-                <w:rPr>
-                  <w:rStyle w:val="PlaceholderText"/>
-                </w:rPr>
-                <w:alias w:val="School Attended"/>
-                <w:tag w:val="School Attended"/>
-                <w:id w:val="1030"/>
-                <w:placeholder>
-                  <w:docPart w:val="DefaultPlaceholder_-1854013440"/>
-                </w:placeholder>
-                <w:showingPlcHdr/>
-                <w:text/>
-              </w:sdtPr>
-              <w:sdtContent>
-                <w:r>
-                  <w:rPr>
-                    <w:rStyle w:val="PlaceholderText"/>
-                  </w:rPr>
-                  <w:t>Click or tap to enter text.</w:t>
-                </w:r>
-              </w:sdtContent>
-            </w:sdt>
-          </w:p>
-        </w:tc>
-        <w:tc>
-          <w:tcPr>
-            <w:tcW w:w="5040" w:type="dxa"/>
-            <w:vAlign w:val="top"/>
-          </w:tcPr>
-          <w:p>
-            <w:pPr>
-              <w:spacing w:before="0" w:after="60" w:line="240" w:lineRule="auto"/>
-            </w:pPr>
-            <w:sdt>
-              <w:sdtPr>
-                <w:rPr>
-                  <w:rStyle w:val="PlaceholderText"/>
-                </w:rPr>
-                <w:alias w:val="Year Attended"/>
-                <w:tag w:val="Year Attended"/>
-                <w:id w:val="1031"/>
-                <w:placeholder>
-                  <w:docPart w:val="DefaultPlaceholder_-1854013440"/>
-                </w:placeholder>
-                <w:showingPlcHdr/>
-                <w:text/>
-              </w:sdtPr>
-              <w:sdtContent>
-                <w:r>
-                  <w:rPr>
-                    <w:rStyle w:val="PlaceholderText"/>
-                  </w:rPr>
-                  <w:t>Click or tap to enter text.</w:t>
-                </w:r>
-              </w:sdtContent>
-            </w:sdt>
           </w:p>
         </w:tc>
       </w:tr>
@@ -2065,6 +2158,76 @@
                 <w:alias w:val="Year Attended"/>
                 <w:tag w:val="Year Attended"/>
                 <w:id w:val="1037"/>
+                <w:placeholder>
+                  <w:docPart w:val="DefaultPlaceholder_-1854013440"/>
+                </w:placeholder>
+                <w:showingPlcHdr/>
+                <w:text/>
+              </w:sdtPr>
+              <w:sdtContent>
+                <w:r>
+                  <w:rPr>
+                    <w:rStyle w:val="PlaceholderText"/>
+                  </w:rPr>
+                  <w:t>Click or tap to enter text.</w:t>
+                </w:r>
+              </w:sdtContent>
+            </w:sdt>
+          </w:p>
+        </w:tc>
+      </w:tr>
+      <w:tr>
+        <w:tc>
+          <w:tcPr>
+            <w:tcW w:w="5040" w:type="dxa"/>
+            <w:vAlign w:val="top"/>
+          </w:tcPr>
+          <w:p>
+            <w:pPr>
+              <w:spacing w:before="0" w:after="60" w:line="240" w:lineRule="auto"/>
+            </w:pPr>
+            <w:sdt>
+              <w:sdtPr>
+                <w:rPr>
+                  <w:rStyle w:val="PlaceholderText"/>
+                </w:rPr>
+                <w:alias w:val="School Attended"/>
+                <w:tag w:val="School Attended"/>
+                <w:id w:val="1038"/>
+                <w:placeholder>
+                  <w:docPart w:val="DefaultPlaceholder_-1854013440"/>
+                </w:placeholder>
+                <w:showingPlcHdr/>
+                <w:text/>
+              </w:sdtPr>
+              <w:sdtContent>
+                <w:r>
+                  <w:rPr>
+                    <w:rStyle w:val="PlaceholderText"/>
+                  </w:rPr>
+                  <w:t>Click or tap to enter text.</w:t>
+                </w:r>
+              </w:sdtContent>
+            </w:sdt>
+          </w:p>
+        </w:tc>
+        <w:tc>
+          <w:tcPr>
+            <w:tcW w:w="5040" w:type="dxa"/>
+            <w:vAlign w:val="top"/>
+          </w:tcPr>
+          <w:p>
+            <w:pPr>
+              <w:spacing w:before="0" w:after="60" w:line="240" w:lineRule="auto"/>
+            </w:pPr>
+            <w:sdt>
+              <w:sdtPr>
+                <w:rPr>
+                  <w:rStyle w:val="PlaceholderText"/>
+                </w:rPr>
+                <w:alias w:val="Year Attended"/>
+                <w:tag w:val="Year Attended"/>
+                <w:id w:val="1039"/>
                 <w:placeholder>
                   <w:docPart w:val="DefaultPlaceholder_-1854013440"/>
                 </w:placeholder>
@@ -2091,8 +2254,8 @@
     </w:p>
     <w:p>
       <w:pPr>
-        <w:shd w:val="clear" w:color="auto" w:fill="2E5A87"/>
-        <w:spacing w:before="120" w:after="60" w:line="240" w:lineRule="auto"/>
+        <w:shd w:val="clear" w:color="auto" w:fill="003344"/>
+        <w:spacing w:before="140" w:after="60" w:line="240" w:lineRule="auto"/>
       </w:pPr>
       <w:r>
         <w:rPr>
@@ -2115,7 +2278,7 @@
           </w:rPr>
           <w:alias w:val="Family History"/>
           <w:tag w:val="Family History"/>
-          <w:id w:val="1038"/>
+          <w:id w:val="1040"/>
           <w:placeholder>
             <w:docPart w:val="DefaultPlaceholder_-1854013440"/>
           </w:placeholder>
@@ -2134,8 +2297,8 @@
     </w:p>
     <w:p>
       <w:pPr>
-        <w:shd w:val="clear" w:color="auto" w:fill="2E5A87"/>
-        <w:spacing w:before="120" w:after="60" w:line="240" w:lineRule="auto"/>
+        <w:shd w:val="clear" w:color="auto" w:fill="003344"/>
+        <w:spacing w:before="140" w:after="60" w:line="240" w:lineRule="auto"/>
       </w:pPr>
       <w:r>
         <w:rPr>
@@ -2158,7 +2321,7 @@
           </w:rPr>
           <w:alias w:val="Additional Information"/>
           <w:tag w:val="Additional Information"/>
-          <w:id w:val="1039"/>
+          <w:id w:val="1041"/>
           <w:placeholder>
             <w:docPart w:val="DefaultPlaceholder_-1854013440"/>
           </w:placeholder>
@@ -2177,8 +2340,8 @@
     </w:p>
     <w:p>
       <w:pPr>
-        <w:shd w:val="clear" w:color="auto" w:fill="2E5A87"/>
-        <w:spacing w:before="120" w:after="60" w:line="240" w:lineRule="auto"/>
+        <w:shd w:val="clear" w:color="auto" w:fill="003344"/>
+        <w:spacing w:before="140" w:after="60" w:line="240" w:lineRule="auto"/>
       </w:pPr>
       <w:r>
         <w:rPr>
@@ -2215,7 +2378,7 @@
         </w:rPr>
         <w:t xml:space="preserve">•  </w:t>
       </w:r>
-      <w:hyperlink r:id="rHl1040">
+      <w:hyperlink r:id="rHl1042">
         <w:r>
           <w:rPr>
             <w:rStyle w:val="Hyperlink"/>
@@ -2236,7 +2399,7 @@
         </w:rPr>
         <w:t xml:space="preserve">•  </w:t>
       </w:r>
-      <w:hyperlink r:id="rHl1041">
+      <w:hyperlink r:id="rHl1043">
         <w:r>
           <w:rPr>
             <w:rStyle w:val="Hyperlink"/>
@@ -2277,7 +2440,7 @@
         <w:tc>
           <w:tcPr>
             <w:tcW w:w="2200" w:type="dxa"/>
-            <w:shd w:val="clear" w:color="auto" w:fill="DCE6F1"/>
+            <w:shd w:val="clear" w:color="auto" w:fill="DCE6EA"/>
             <w:vAlign w:val="top"/>
           </w:tcPr>
           <w:p>
@@ -2287,6 +2450,7 @@
             <w:r>
               <w:rPr>
                 <w:b/>
+                <w:color w:val="003344"/>
                 <w:sz w:val="20"/>
                 <w:szCs w:val="20"/>
               </w:rPr>
@@ -2297,7 +2461,7 @@
         <w:tc>
           <w:tcPr>
             <w:tcW w:w="3200" w:type="dxa"/>
-            <w:shd w:val="clear" w:color="auto" w:fill="DCE6F1"/>
+            <w:shd w:val="clear" w:color="auto" w:fill="DCE6EA"/>
             <w:vAlign w:val="top"/>
           </w:tcPr>
           <w:p>
@@ -2307,6 +2471,7 @@
             <w:r>
               <w:rPr>
                 <w:b/>
+                <w:color w:val="003344"/>
                 <w:sz w:val="20"/>
                 <w:szCs w:val="20"/>
               </w:rPr>
@@ -2317,7 +2482,7 @@
         <w:tc>
           <w:tcPr>
             <w:tcW w:w="4680" w:type="dxa"/>
-            <w:shd w:val="clear" w:color="auto" w:fill="DCE6F1"/>
+            <w:shd w:val="clear" w:color="auto" w:fill="DCE6EA"/>
             <w:vAlign w:val="top"/>
           </w:tcPr>
           <w:p>
@@ -2327,6 +2492,7 @@
             <w:r>
               <w:rPr>
                 <w:b/>
+                <w:color w:val="003344"/>
                 <w:sz w:val="20"/>
                 <w:szCs w:val="20"/>
               </w:rPr>
@@ -2352,7 +2518,7 @@
                 </w:rPr>
                 <w:alias w:val="Date"/>
                 <w:tag w:val="Date"/>
-                <w:id w:val="1042"/>
+                <w:id w:val="1044"/>
                 <w:placeholder>
                   <w:docPart w:val="DefaultPlaceholder_-1854013440"/>
                 </w:placeholder>
@@ -2386,7 +2552,7 @@
                 </w:rPr>
                 <w:alias w:val="Test / Assessor"/>
                 <w:tag w:val="Test / Assessor"/>
-                <w:id w:val="1043"/>
+                <w:id w:val="1045"/>
                 <w:placeholder>
                   <w:docPart w:val="DefaultPlaceholder_-1854013440"/>
                 </w:placeholder>
@@ -2420,7 +2586,7 @@
                 </w:rPr>
                 <w:alias w:val="Results / Diagnosis"/>
                 <w:tag w:val="Results / Diagnosis"/>
-                <w:id w:val="1044"/>
+                <w:id w:val="1046"/>
                 <w:placeholder>
                   <w:docPart w:val="DefaultPlaceholder_-1854013440"/>
                 </w:placeholder>
@@ -2456,7 +2622,7 @@
                 </w:rPr>
                 <w:alias w:val="Date"/>
                 <w:tag w:val="Date"/>
-                <w:id w:val="1045"/>
+                <w:id w:val="1047"/>
                 <w:placeholder>
                   <w:docPart w:val="DefaultPlaceholder_-1854013440"/>
                 </w:placeholder>
@@ -2490,7 +2656,7 @@
                 </w:rPr>
                 <w:alias w:val="Test / Assessor"/>
                 <w:tag w:val="Test / Assessor"/>
-                <w:id w:val="1046"/>
+                <w:id w:val="1048"/>
                 <w:placeholder>
                   <w:docPart w:val="DefaultPlaceholder_-1854013440"/>
                 </w:placeholder>
@@ -2524,7 +2690,7 @@
                 </w:rPr>
                 <w:alias w:val="Results / Diagnosis"/>
                 <w:tag w:val="Results / Diagnosis"/>
-                <w:id w:val="1047"/>
+                <w:id w:val="1049"/>
                 <w:placeholder>
                   <w:docPart w:val="DefaultPlaceholder_-1854013440"/>
                 </w:placeholder>
@@ -2560,7 +2726,7 @@
                 </w:rPr>
                 <w:alias w:val="Date"/>
                 <w:tag w:val="Date"/>
-                <w:id w:val="1048"/>
+                <w:id w:val="1050"/>
                 <w:placeholder>
                   <w:docPart w:val="DefaultPlaceholder_-1854013440"/>
                 </w:placeholder>
@@ -2594,7 +2760,7 @@
                 </w:rPr>
                 <w:alias w:val="Test / Assessor"/>
                 <w:tag w:val="Test / Assessor"/>
-                <w:id w:val="1049"/>
+                <w:id w:val="1051"/>
                 <w:placeholder>
                   <w:docPart w:val="DefaultPlaceholder_-1854013440"/>
                 </w:placeholder>
@@ -2628,7 +2794,7 @@
                 </w:rPr>
                 <w:alias w:val="Results / Diagnosis"/>
                 <w:tag w:val="Results / Diagnosis"/>
-                <w:id w:val="1050"/>
+                <w:id w:val="1052"/>
                 <w:placeholder>
                   <w:docPart w:val="DefaultPlaceholder_-1854013440"/>
                 </w:placeholder>
@@ -2655,8 +2821,8 @@
     </w:p>
     <w:p>
       <w:pPr>
-        <w:shd w:val="clear" w:color="auto" w:fill="2E5A87"/>
-        <w:spacing w:before="120" w:after="60" w:line="240" w:lineRule="auto"/>
+        <w:shd w:val="clear" w:color="auto" w:fill="003344"/>
+        <w:spacing w:before="140" w:after="60" w:line="240" w:lineRule="auto"/>
       </w:pPr>
       <w:r>
         <w:rPr>
@@ -2714,7 +2880,7 @@
         <w:tc>
           <w:tcPr>
             <w:tcW w:w="2200" w:type="dxa"/>
-            <w:shd w:val="clear" w:color="auto" w:fill="DCE6F1"/>
+            <w:shd w:val="clear" w:color="auto" w:fill="DCE6EA"/>
             <w:vAlign w:val="top"/>
           </w:tcPr>
           <w:p>
@@ -2724,6 +2890,7 @@
             <w:r>
               <w:rPr>
                 <w:b/>
+                <w:color w:val="003344"/>
                 <w:sz w:val="20"/>
                 <w:szCs w:val="20"/>
               </w:rPr>
@@ -2734,7 +2901,7 @@
         <w:tc>
           <w:tcPr>
             <w:tcW w:w="3080" w:type="dxa"/>
-            <w:shd w:val="clear" w:color="auto" w:fill="DCE6F1"/>
+            <w:shd w:val="clear" w:color="auto" w:fill="DCE6EA"/>
             <w:vAlign w:val="top"/>
           </w:tcPr>
           <w:p>
@@ -2744,6 +2911,7 @@
             <w:r>
               <w:rPr>
                 <w:b/>
+                <w:color w:val="003344"/>
                 <w:sz w:val="20"/>
                 <w:szCs w:val="20"/>
               </w:rPr>
@@ -2754,7 +2922,7 @@
         <w:tc>
           <w:tcPr>
             <w:tcW w:w="2400" w:type="dxa"/>
-            <w:shd w:val="clear" w:color="auto" w:fill="DCE6F1"/>
+            <w:shd w:val="clear" w:color="auto" w:fill="DCE6EA"/>
             <w:vAlign w:val="top"/>
           </w:tcPr>
           <w:p>
@@ -2764,6 +2932,7 @@
             <w:r>
               <w:rPr>
                 <w:b/>
+                <w:color w:val="003344"/>
                 <w:sz w:val="20"/>
                 <w:szCs w:val="20"/>
               </w:rPr>
@@ -2774,7 +2943,7 @@
         <w:tc>
           <w:tcPr>
             <w:tcW w:w="2400" w:type="dxa"/>
-            <w:shd w:val="clear" w:color="auto" w:fill="DCE6F1"/>
+            <w:shd w:val="clear" w:color="auto" w:fill="DCE6EA"/>
             <w:vAlign w:val="top"/>
           </w:tcPr>
           <w:p>
@@ -2784,6 +2953,7 @@
             <w:r>
               <w:rPr>
                 <w:b/>
+                <w:color w:val="003344"/>
                 <w:sz w:val="20"/>
                 <w:szCs w:val="20"/>
               </w:rPr>
@@ -2809,7 +2979,7 @@
                 </w:rPr>
                 <w:alias w:val="Date Given"/>
                 <w:tag w:val="Date Given"/>
-                <w:id w:val="1051"/>
+                <w:id w:val="1053"/>
                 <w:placeholder>
                   <w:docPart w:val="DefaultPlaceholder_-1854013440"/>
                 </w:placeholder>
@@ -2843,7 +3013,7 @@
                 </w:rPr>
                 <w:alias w:val="Test"/>
                 <w:tag w:val="Test"/>
-                <w:id w:val="1052"/>
+                <w:id w:val="1054"/>
                 <w:placeholder>
                   <w:docPart w:val="DefaultPlaceholder_-1854013440"/>
                 </w:placeholder>
@@ -2877,7 +3047,7 @@
                 </w:rPr>
                 <w:alias w:val="2025 Results"/>
                 <w:tag w:val="2025 Results"/>
-                <w:id w:val="1053"/>
+                <w:id w:val="1055"/>
                 <w:placeholder>
                   <w:docPart w:val="DefaultPlaceholder_-1854013440"/>
                 </w:placeholder>
@@ -2911,7 +3081,7 @@
                 </w:rPr>
                 <w:alias w:val="2026 Results"/>
                 <w:tag w:val="2026 Results"/>
-                <w:id w:val="1054"/>
+                <w:id w:val="1056"/>
                 <w:placeholder>
                   <w:docPart w:val="DefaultPlaceholder_-1854013440"/>
                 </w:placeholder>
@@ -2947,7 +3117,7 @@
                 </w:rPr>
                 <w:alias w:val="Date Given"/>
                 <w:tag w:val="Date Given"/>
-                <w:id w:val="1055"/>
+                <w:id w:val="1057"/>
                 <w:placeholder>
                   <w:docPart w:val="DefaultPlaceholder_-1854013440"/>
                 </w:placeholder>
@@ -2981,7 +3151,7 @@
                 </w:rPr>
                 <w:alias w:val="Test"/>
                 <w:tag w:val="Test"/>
-                <w:id w:val="1056"/>
+                <w:id w:val="1058"/>
                 <w:placeholder>
                   <w:docPart w:val="DefaultPlaceholder_-1854013440"/>
                 </w:placeholder>
@@ -3015,7 +3185,7 @@
                 </w:rPr>
                 <w:alias w:val="2025 Results"/>
                 <w:tag w:val="2025 Results"/>
-                <w:id w:val="1057"/>
+                <w:id w:val="1059"/>
                 <w:placeholder>
                   <w:docPart w:val="DefaultPlaceholder_-1854013440"/>
                 </w:placeholder>
@@ -3049,7 +3219,7 @@
                 </w:rPr>
                 <w:alias w:val="2026 Results"/>
                 <w:tag w:val="2026 Results"/>
-                <w:id w:val="1058"/>
+                <w:id w:val="1060"/>
                 <w:placeholder>
                   <w:docPart w:val="DefaultPlaceholder_-1854013440"/>
                 </w:placeholder>
@@ -3085,7 +3255,7 @@
                 </w:rPr>
                 <w:alias w:val="Date Given"/>
                 <w:tag w:val="Date Given"/>
-                <w:id w:val="1059"/>
+                <w:id w:val="1061"/>
                 <w:placeholder>
                   <w:docPart w:val="DefaultPlaceholder_-1854013440"/>
                 </w:placeholder>
@@ -3119,7 +3289,7 @@
                 </w:rPr>
                 <w:alias w:val="Test"/>
                 <w:tag w:val="Test"/>
-                <w:id w:val="1060"/>
+                <w:id w:val="1062"/>
                 <w:placeholder>
                   <w:docPart w:val="DefaultPlaceholder_-1854013440"/>
                 </w:placeholder>
@@ -3153,7 +3323,7 @@
                 </w:rPr>
                 <w:alias w:val="2025 Results"/>
                 <w:tag w:val="2025 Results"/>
-                <w:id w:val="1061"/>
+                <w:id w:val="1063"/>
                 <w:placeholder>
                   <w:docPart w:val="DefaultPlaceholder_-1854013440"/>
                 </w:placeholder>
@@ -3187,7 +3357,7 @@
                 </w:rPr>
                 <w:alias w:val="2026 Results"/>
                 <w:tag w:val="2026 Results"/>
-                <w:id w:val="1062"/>
+                <w:id w:val="1064"/>
                 <w:placeholder>
                   <w:docPart w:val="DefaultPlaceholder_-1854013440"/>
                 </w:placeholder>
@@ -3214,8 +3384,8 @@
     </w:p>
     <w:p>
       <w:pPr>
-        <w:shd w:val="clear" w:color="auto" w:fill="2E5A87"/>
-        <w:spacing w:before="120" w:after="60" w:line="240" w:lineRule="auto"/>
+        <w:shd w:val="clear" w:color="auto" w:fill="003344"/>
+        <w:spacing w:before="140" w:after="60" w:line="240" w:lineRule="auto"/>
       </w:pPr>
       <w:r>
         <w:rPr>
@@ -3238,7 +3408,7 @@
           </w:rPr>
           <w:alias w:val="Summary of Assessed Educational Performance"/>
           <w:tag w:val="Summary of Assessed Educational Performance"/>
-          <w:id w:val="1063"/>
+          <w:id w:val="1065"/>
           <w:placeholder>
             <w:docPart w:val="DefaultPlaceholder_-1854013440"/>
           </w:placeholder>
@@ -3257,8 +3427,8 @@
     </w:p>
     <w:p>
       <w:pPr>
-        <w:shd w:val="clear" w:color="auto" w:fill="2E5A87"/>
-        <w:spacing w:before="120" w:after="60" w:line="240" w:lineRule="auto"/>
+        <w:shd w:val="clear" w:color="auto" w:fill="003344"/>
+        <w:spacing w:before="140" w:after="60" w:line="240" w:lineRule="auto"/>
       </w:pPr>
       <w:r>
         <w:rPr>
@@ -3314,7 +3484,7 @@
         <w:tc>
           <w:tcPr>
             <w:tcW w:w="5040" w:type="dxa"/>
-            <w:shd w:val="clear" w:color="auto" w:fill="DCE6F1"/>
+            <w:shd w:val="clear" w:color="auto" w:fill="DCE6EA"/>
             <w:vAlign w:val="top"/>
           </w:tcPr>
           <w:p>
@@ -3324,6 +3494,7 @@
             <w:r>
               <w:rPr>
                 <w:b/>
+                <w:color w:val="003344"/>
                 <w:sz w:val="20"/>
                 <w:szCs w:val="20"/>
               </w:rPr>
@@ -3334,7 +3505,7 @@
         <w:tc>
           <w:tcPr>
             <w:tcW w:w="5040" w:type="dxa"/>
-            <w:shd w:val="clear" w:color="auto" w:fill="DCE6F1"/>
+            <w:shd w:val="clear" w:color="auto" w:fill="DCE6EA"/>
             <w:vAlign w:val="top"/>
           </w:tcPr>
           <w:p>
@@ -3344,6 +3515,7 @@
             <w:r>
               <w:rPr>
                 <w:b/>
+                <w:color w:val="003344"/>
                 <w:sz w:val="20"/>
                 <w:szCs w:val="20"/>
               </w:rPr>
@@ -3369,7 +3541,7 @@
                 </w:rPr>
                 <w:alias w:val="Area of Strength"/>
                 <w:tag w:val="Area of Strength"/>
-                <w:id w:val="1064"/>
+                <w:id w:val="1066"/>
                 <w:placeholder>
                   <w:docPart w:val="DefaultPlaceholder_-1854013440"/>
                 </w:placeholder>
@@ -3426,7 +3598,7 @@
                 </w:rPr>
                 <w:alias w:val="Area to Improve"/>
                 <w:tag w:val="Area to Improve"/>
-                <w:id w:val="1065"/>
+                <w:id w:val="1067"/>
                 <w:placeholder>
                   <w:docPart w:val="DefaultPlaceholder_-1854013440"/>
                 </w:placeholder>
@@ -3481,7 +3653,7 @@
                 </w:rPr>
                 <w:alias w:val="Area of Strength"/>
                 <w:tag w:val="Area of Strength"/>
-                <w:id w:val="1066"/>
+                <w:id w:val="1068"/>
                 <w:placeholder>
                   <w:docPart w:val="DefaultPlaceholder_-1854013440"/>
                 </w:placeholder>
@@ -3538,7 +3710,7 @@
                 </w:rPr>
                 <w:alias w:val="Area to Improve"/>
                 <w:tag w:val="Area to Improve"/>
-                <w:id w:val="1067"/>
+                <w:id w:val="1069"/>
                 <w:placeholder>
                   <w:docPart w:val="DefaultPlaceholder_-1854013440"/>
                 </w:placeholder>
@@ -3593,7 +3765,7 @@
                 </w:rPr>
                 <w:alias w:val="Area of Strength"/>
                 <w:tag w:val="Area of Strength"/>
-                <w:id w:val="1068"/>
+                <w:id w:val="1070"/>
                 <w:placeholder>
                   <w:docPart w:val="DefaultPlaceholder_-1854013440"/>
                 </w:placeholder>
@@ -3650,7 +3822,7 @@
                 </w:rPr>
                 <w:alias w:val="Area to Improve"/>
                 <w:tag w:val="Area to Improve"/>
-                <w:id w:val="1069"/>
+                <w:id w:val="1071"/>
                 <w:placeholder>
                   <w:docPart w:val="DefaultPlaceholder_-1854013440"/>
                 </w:placeholder>
@@ -3705,7 +3877,7 @@
                 </w:rPr>
                 <w:alias w:val="Area of Strength"/>
                 <w:tag w:val="Area of Strength"/>
-                <w:id w:val="1070"/>
+                <w:id w:val="1072"/>
                 <w:placeholder>
                   <w:docPart w:val="DefaultPlaceholder_-1854013440"/>
                 </w:placeholder>
@@ -3762,7 +3934,7 @@
                 </w:rPr>
                 <w:alias w:val="Area to Improve"/>
                 <w:tag w:val="Area to Improve"/>
-                <w:id w:val="1071"/>
+                <w:id w:val="1073"/>
                 <w:placeholder>
                   <w:docPart w:val="DefaultPlaceholder_-1854013440"/>
                 </w:placeholder>
@@ -3817,7 +3989,7 @@
                 </w:rPr>
                 <w:alias w:val="Area of Strength"/>
                 <w:tag w:val="Area of Strength"/>
-                <w:id w:val="1072"/>
+                <w:id w:val="1074"/>
                 <w:placeholder>
                   <w:docPart w:val="DefaultPlaceholder_-1854013440"/>
                 </w:placeholder>
@@ -3874,7 +4046,7 @@
                 </w:rPr>
                 <w:alias w:val="Area to Improve"/>
                 <w:tag w:val="Area to Improve"/>
-                <w:id w:val="1073"/>
+                <w:id w:val="1075"/>
                 <w:placeholder>
                   <w:docPart w:val="DefaultPlaceholder_-1854013440"/>
                 </w:placeholder>
@@ -3920,8 +4092,8 @@
     </w:p>
     <w:p>
       <w:pPr>
-        <w:shd w:val="clear" w:color="auto" w:fill="2E5A87"/>
-        <w:spacing w:before="120" w:after="60" w:line="240" w:lineRule="auto"/>
+        <w:shd w:val="clear" w:color="auto" w:fill="003344"/>
+        <w:spacing w:before="140" w:after="60" w:line="240" w:lineRule="auto"/>
       </w:pPr>
       <w:r>
         <w:rPr>
@@ -3985,86 +4157,6 @@
                 <w:rPr>
                   <w:rFonts w:ascii="MS Gothic" w:eastAsia="MS Gothic" w:hAnsi="MS Gothic" w:hint="eastAsia"/>
                 </w:rPr>
-                <w:id w:val="1074"/>
-                <w14:checkbox>
-                  <w14:checked w14:val="0"/>
-                  <w14:checkedState w14:val="2612" w14:font="MS Gothic"/>
-                  <w14:uncheckedState w14:val="2610" w14:font="MS Gothic"/>
-                </w14:checkbox>
-              </w:sdtPr>
-              <w:sdtContent>
-                <w:r>
-                  <w:rPr>
-                    <w:rFonts w:ascii="MS Gothic" w:eastAsia="MS Gothic" w:hAnsi="MS Gothic" w:hint="eastAsia"/>
-                  </w:rPr>
-                  <w:t>☐</w:t>
-                </w:r>
-              </w:sdtContent>
-            </w:sdt>
-            <w:r>
-              <w:rPr>
-                <w:sz w:val="20"/>
-                <w:szCs w:val="20"/>
-              </w:rPr>
-              <w:t xml:space="preserve">  Avoid timed tasks</w:t>
-            </w:r>
-          </w:p>
-        </w:tc>
-        <w:tc>
-          <w:tcPr>
-            <w:tcW w:w="5040" w:type="dxa"/>
-            <w:vAlign w:val="top"/>
-          </w:tcPr>
-          <w:p>
-            <w:pPr>
-              <w:spacing w:before="0" w:after="20" w:line="240" w:lineRule="auto"/>
-            </w:pPr>
-            <w:sdt>
-              <w:sdtPr>
-                <w:rPr>
-                  <w:rFonts w:ascii="MS Gothic" w:eastAsia="MS Gothic" w:hAnsi="MS Gothic" w:hint="eastAsia"/>
-                </w:rPr>
-                <w:id w:val="1075"/>
-                <w14:checkbox>
-                  <w14:checked w14:val="0"/>
-                  <w14:checkedState w14:val="2612" w14:font="MS Gothic"/>
-                  <w14:uncheckedState w14:val="2610" w14:font="MS Gothic"/>
-                </w14:checkbox>
-              </w:sdtPr>
-              <w:sdtContent>
-                <w:r>
-                  <w:rPr>
-                    <w:rFonts w:ascii="MS Gothic" w:eastAsia="MS Gothic" w:hAnsi="MS Gothic" w:hint="eastAsia"/>
-                  </w:rPr>
-                  <w:t>☐</w:t>
-                </w:r>
-              </w:sdtContent>
-            </w:sdt>
-            <w:r>
-              <w:rPr>
-                <w:sz w:val="20"/>
-                <w:szCs w:val="20"/>
-              </w:rPr>
-              <w:t xml:space="preserve">  Frequent breaks</w:t>
-            </w:r>
-          </w:p>
-        </w:tc>
-      </w:tr>
-      <w:tr>
-        <w:tc>
-          <w:tcPr>
-            <w:tcW w:w="5040" w:type="dxa"/>
-            <w:vAlign w:val="top"/>
-          </w:tcPr>
-          <w:p>
-            <w:pPr>
-              <w:spacing w:before="0" w:after="20" w:line="240" w:lineRule="auto"/>
-            </w:pPr>
-            <w:sdt>
-              <w:sdtPr>
-                <w:rPr>
-                  <w:rFonts w:ascii="MS Gothic" w:eastAsia="MS Gothic" w:hAnsi="MS Gothic" w:hint="eastAsia"/>
-                </w:rPr>
                 <w:id w:val="1076"/>
                 <w14:checkbox>
                   <w14:checked w14:val="0"/>
@@ -4086,7 +4178,7 @@
                 <w:sz w:val="20"/>
                 <w:szCs w:val="20"/>
               </w:rPr>
-              <w:t xml:space="preserve">  Break assignments into shorter tasks</w:t>
+              <w:t xml:space="preserve">  Avoid timed tasks</w:t>
             </w:r>
           </w:p>
         </w:tc>
@@ -4125,7 +4217,7 @@
                 <w:sz w:val="20"/>
                 <w:szCs w:val="20"/>
               </w:rPr>
-              <w:t xml:space="preserve">  Chunking of information</w:t>
+              <w:t xml:space="preserve">  Frequent breaks</w:t>
             </w:r>
           </w:p>
         </w:tc>
@@ -4166,7 +4258,7 @@
                 <w:sz w:val="20"/>
                 <w:szCs w:val="20"/>
               </w:rPr>
-              <w:t xml:space="preserve">  Concrete examples</w:t>
+              <w:t xml:space="preserve">  Break assignments into shorter tasks</w:t>
             </w:r>
           </w:p>
         </w:tc>
@@ -4205,7 +4297,7 @@
                 <w:sz w:val="20"/>
                 <w:szCs w:val="20"/>
               </w:rPr>
-              <w:t xml:space="preserve">  Visual aids / graphic organizers</w:t>
+              <w:t xml:space="preserve">  Chunking of information</w:t>
             </w:r>
           </w:p>
         </w:tc>
@@ -4246,7 +4338,7 @@
                 <w:sz w:val="20"/>
                 <w:szCs w:val="20"/>
               </w:rPr>
-              <w:t xml:space="preserve">  Exemplars</w:t>
+              <w:t xml:space="preserve">  Concrete examples</w:t>
             </w:r>
           </w:p>
         </w:tc>
@@ -4285,7 +4377,7 @@
                 <w:sz w:val="20"/>
                 <w:szCs w:val="20"/>
               </w:rPr>
-              <w:t xml:space="preserve">  Access to a reader or scribe</w:t>
+              <w:t xml:space="preserve">  Visual aids / graphic organizers</w:t>
             </w:r>
           </w:p>
         </w:tc>
@@ -4326,7 +4418,7 @@
                 <w:sz w:val="20"/>
                 <w:szCs w:val="20"/>
               </w:rPr>
-              <w:t xml:space="preserve">  Extra time</w:t>
+              <w:t xml:space="preserve">  Exemplars</w:t>
             </w:r>
           </w:p>
         </w:tc>
@@ -4365,7 +4457,7 @@
                 <w:sz w:val="20"/>
                 <w:szCs w:val="20"/>
               </w:rPr>
-              <w:t xml:space="preserve">  Alternate setting for assessments</w:t>
+              <w:t xml:space="preserve">  Access to a reader or scribe</w:t>
             </w:r>
           </w:p>
         </w:tc>
@@ -4406,7 +4498,7 @@
                 <w:sz w:val="20"/>
                 <w:szCs w:val="20"/>
               </w:rPr>
-              <w:t xml:space="preserve">  Extra assessment time</w:t>
+              <w:t xml:space="preserve">  Extra time</w:t>
             </w:r>
           </w:p>
         </w:tc>
@@ -4445,7 +4537,7 @@
                 <w:sz w:val="20"/>
                 <w:szCs w:val="20"/>
               </w:rPr>
-              <w:t xml:space="preserve">  Use of a calculator</w:t>
+              <w:t xml:space="preserve">  Alternate setting for assessments</w:t>
             </w:r>
           </w:p>
         </w:tc>
@@ -4486,7 +4578,7 @@
                 <w:sz w:val="20"/>
                 <w:szCs w:val="20"/>
               </w:rPr>
-              <w:t xml:space="preserve">  Flexible deadlines</w:t>
+              <w:t xml:space="preserve">  Extra assessment time</w:t>
             </w:r>
           </w:p>
         </w:tc>
@@ -4525,7 +4617,7 @@
                 <w:sz w:val="20"/>
                 <w:szCs w:val="20"/>
               </w:rPr>
-              <w:t xml:space="preserve">  Digital or recorded notes</w:t>
+              <w:t xml:space="preserve">  Use of a calculator</w:t>
             </w:r>
           </w:p>
         </w:tc>
@@ -4566,7 +4658,7 @@
                 <w:sz w:val="20"/>
                 <w:szCs w:val="20"/>
               </w:rPr>
-              <w:t xml:space="preserve">  Preferential seating / pinned view</w:t>
+              <w:t xml:space="preserve">  Flexible deadlines</w:t>
             </w:r>
           </w:p>
         </w:tc>
@@ -4605,7 +4697,7 @@
                 <w:sz w:val="20"/>
                 <w:szCs w:val="20"/>
               </w:rPr>
-              <w:t xml:space="preserve">  Movement breaks</w:t>
+              <w:t xml:space="preserve">  Digital or recorded notes</w:t>
             </w:r>
           </w:p>
         </w:tc>
@@ -4646,7 +4738,7 @@
                 <w:sz w:val="20"/>
                 <w:szCs w:val="20"/>
               </w:rPr>
-              <w:t xml:space="preserve">  Reduced workload / fewer questions</w:t>
+              <w:t xml:space="preserve">  Preferential seating / pinned view</w:t>
             </w:r>
           </w:p>
         </w:tc>
@@ -4685,7 +4777,7 @@
                 <w:sz w:val="20"/>
                 <w:szCs w:val="20"/>
               </w:rPr>
-              <w:t xml:space="preserve">  Checklists and visual agendas</w:t>
+              <w:t xml:space="preserve">  Movement breaks</w:t>
             </w:r>
           </w:p>
         </w:tc>
@@ -4726,7 +4818,7 @@
                 <w:sz w:val="20"/>
                 <w:szCs w:val="20"/>
               </w:rPr>
-              <w:t xml:space="preserve">  Use of assistive technology</w:t>
+              <w:t xml:space="preserve">  Reduced workload / fewer questions</w:t>
             </w:r>
           </w:p>
         </w:tc>
@@ -4765,7 +4857,7 @@
                 <w:sz w:val="20"/>
                 <w:szCs w:val="20"/>
               </w:rPr>
-              <w:t xml:space="preserve">  Reduced visual / auditory distractions</w:t>
+              <w:t xml:space="preserve">  Checklists and visual agendas</w:t>
             </w:r>
           </w:p>
         </w:tc>
@@ -4806,7 +4898,7 @@
                 <w:sz w:val="20"/>
                 <w:szCs w:val="20"/>
               </w:rPr>
-              <w:t xml:space="preserve">  Text-to-speech / audiobooks</w:t>
+              <w:t xml:space="preserve">  Use of assistive technology</w:t>
             </w:r>
           </w:p>
         </w:tc>
@@ -4845,7 +4937,7 @@
                 <w:sz w:val="20"/>
                 <w:szCs w:val="20"/>
               </w:rPr>
-              <w:t xml:space="preserve">  Verbal and written instructions</w:t>
+              <w:t xml:space="preserve">  Reduced visual / auditory distractions</w:t>
             </w:r>
           </w:p>
         </w:tc>
@@ -4886,6 +4978,86 @@
                 <w:sz w:val="20"/>
                 <w:szCs w:val="20"/>
               </w:rPr>
+              <w:t xml:space="preserve">  Text-to-speech / audiobooks</w:t>
+            </w:r>
+          </w:p>
+        </w:tc>
+        <w:tc>
+          <w:tcPr>
+            <w:tcW w:w="5040" w:type="dxa"/>
+            <w:vAlign w:val="top"/>
+          </w:tcPr>
+          <w:p>
+            <w:pPr>
+              <w:spacing w:before="0" w:after="20" w:line="240" w:lineRule="auto"/>
+            </w:pPr>
+            <w:sdt>
+              <w:sdtPr>
+                <w:rPr>
+                  <w:rFonts w:ascii="MS Gothic" w:eastAsia="MS Gothic" w:hAnsi="MS Gothic" w:hint="eastAsia"/>
+                </w:rPr>
+                <w:id w:val="1097"/>
+                <w14:checkbox>
+                  <w14:checked w14:val="0"/>
+                  <w14:checkedState w14:val="2612" w14:font="MS Gothic"/>
+                  <w14:uncheckedState w14:val="2610" w14:font="MS Gothic"/>
+                </w14:checkbox>
+              </w:sdtPr>
+              <w:sdtContent>
+                <w:r>
+                  <w:rPr>
+                    <w:rFonts w:ascii="MS Gothic" w:eastAsia="MS Gothic" w:hAnsi="MS Gothic" w:hint="eastAsia"/>
+                  </w:rPr>
+                  <w:t>☐</w:t>
+                </w:r>
+              </w:sdtContent>
+            </w:sdt>
+            <w:r>
+              <w:rPr>
+                <w:sz w:val="20"/>
+                <w:szCs w:val="20"/>
+              </w:rPr>
+              <w:t xml:space="preserve">  Verbal and written instructions</w:t>
+            </w:r>
+          </w:p>
+        </w:tc>
+      </w:tr>
+      <w:tr>
+        <w:tc>
+          <w:tcPr>
+            <w:tcW w:w="5040" w:type="dxa"/>
+            <w:vAlign w:val="top"/>
+          </w:tcPr>
+          <w:p>
+            <w:pPr>
+              <w:spacing w:before="0" w:after="20" w:line="240" w:lineRule="auto"/>
+            </w:pPr>
+            <w:sdt>
+              <w:sdtPr>
+                <w:rPr>
+                  <w:rFonts w:ascii="MS Gothic" w:eastAsia="MS Gothic" w:hAnsi="MS Gothic" w:hint="eastAsia"/>
+                </w:rPr>
+                <w:id w:val="1098"/>
+                <w14:checkbox>
+                  <w14:checked w14:val="0"/>
+                  <w14:checkedState w14:val="2612" w14:font="MS Gothic"/>
+                  <w14:uncheckedState w14:val="2610" w14:font="MS Gothic"/>
+                </w14:checkbox>
+              </w:sdtPr>
+              <w:sdtContent>
+                <w:r>
+                  <w:rPr>
+                    <w:rFonts w:ascii="MS Gothic" w:eastAsia="MS Gothic" w:hAnsi="MS Gothic" w:hint="eastAsia"/>
+                  </w:rPr>
+                  <w:t>☐</w:t>
+                </w:r>
+              </w:sdtContent>
+            </w:sdt>
+            <w:r>
+              <w:rPr>
+                <w:sz w:val="20"/>
+                <w:szCs w:val="20"/>
+              </w:rPr>
               <w:t xml:space="preserve">  Speech-to-text software</w:t>
             </w:r>
           </w:p>
@@ -4904,7 +5076,7 @@
                 <w:rPr>
                   <w:rFonts w:ascii="MS Gothic" w:eastAsia="MS Gothic" w:hAnsi="MS Gothic" w:hint="eastAsia"/>
                 </w:rPr>
-                <w:id w:val="1097"/>
+                <w:id w:val="1099"/>
                 <w14:checkbox>
                   <w14:checked w14:val="0"/>
                   <w14:checkedState w14:val="2612" w14:font="MS Gothic"/>
@@ -4955,7 +5127,7 @@
           </w:rPr>
           <w:alias w:val="Other Accommodation"/>
           <w:tag w:val="Other Accommodation"/>
-          <w:id w:val="1098"/>
+          <w:id w:val="1100"/>
           <w:placeholder>
             <w:docPart w:val="DefaultPlaceholder_-1854013440"/>
           </w:placeholder>
@@ -4974,8 +5146,8 @@
     </w:p>
     <w:p>
       <w:pPr>
-        <w:shd w:val="clear" w:color="auto" w:fill="2E5A87"/>
-        <w:spacing w:before="120" w:after="60" w:line="240" w:lineRule="auto"/>
+        <w:shd w:val="clear" w:color="auto" w:fill="003344"/>
+        <w:spacing w:before="140" w:after="60" w:line="240" w:lineRule="auto"/>
       </w:pPr>
       <w:r>
         <w:rPr>
@@ -4989,7 +5161,7 @@
     </w:p>
     <w:p>
       <w:pPr>
-        <w:shd w:val="clear" w:color="auto" w:fill="EEF3F9"/>
+        <w:shd w:val="clear" w:color="auto" w:fill="FBEAD9"/>
         <w:spacing w:before="40" w:after="80" w:line="240" w:lineRule="auto"/>
       </w:pPr>
       <w:r>
@@ -5007,7 +5179,7 @@
           </w:rPr>
           <w:alias w:val="Goal 1 - By (date)"/>
           <w:tag w:val="Goal 1 - By (date)"/>
-          <w:id w:val="1099"/>
+          <w:id w:val="1101"/>
           <w:placeholder>
             <w:docPart w:val="DefaultPlaceholder_-1854013440"/>
           </w:placeholder>
@@ -5037,7 +5209,7 @@
           </w:rPr>
           <w:alias w:val="Goal 1 - Student"/>
           <w:tag w:val="Goal 1 - Student"/>
-          <w:id w:val="1100"/>
+          <w:id w:val="1102"/>
           <w:placeholder>
             <w:docPart w:val="DefaultPlaceholder_-1854013440"/>
           </w:placeholder>
@@ -5067,7 +5239,7 @@
           </w:rPr>
           <w:alias w:val="Goal 1 - Topic"/>
           <w:tag w:val="Goal 1 - Topic"/>
-          <w:id w:val="1101"/>
+          <w:id w:val="1103"/>
           <w:placeholder>
             <w:docPart w:val="DefaultPlaceholder_-1854013440"/>
           </w:placeholder>
@@ -5107,7 +5279,7 @@
           </w:rPr>
           <w:alias w:val="Goal 1 - Detail"/>
           <w:tag w:val="Goal 1 - Detail"/>
-          <w:id w:val="1102"/>
+          <w:id w:val="1104"/>
           <w:placeholder>
             <w:docPart w:val="DefaultPlaceholder_-1854013440"/>
           </w:placeholder>
@@ -5146,7 +5318,7 @@
       <w:r>
         <w:rPr>
           <w:b/>
-          <w:color w:val="2E5A87"/>
+          <w:color w:val="003344"/>
           <w:sz w:val="20"/>
           <w:szCs w:val="20"/>
         </w:rPr>
@@ -5191,86 +5363,6 @@
                 <w:rPr>
                   <w:rFonts w:ascii="MS Gothic" w:eastAsia="MS Gothic" w:hAnsi="MS Gothic" w:hint="eastAsia"/>
                 </w:rPr>
-                <w:id w:val="1103"/>
-                <w14:checkbox>
-                  <w14:checked w14:val="0"/>
-                  <w14:checkedState w14:val="2612" w14:font="MS Gothic"/>
-                  <w14:uncheckedState w14:val="2610" w14:font="MS Gothic"/>
-                </w14:checkbox>
-              </w:sdtPr>
-              <w:sdtContent>
-                <w:r>
-                  <w:rPr>
-                    <w:rFonts w:ascii="MS Gothic" w:eastAsia="MS Gothic" w:hAnsi="MS Gothic" w:hint="eastAsia"/>
-                  </w:rPr>
-                  <w:t>☐</w:t>
-                </w:r>
-              </w:sdtContent>
-            </w:sdt>
-            <w:r>
-              <w:rPr>
-                <w:sz w:val="20"/>
-                <w:szCs w:val="20"/>
-              </w:rPr>
-              <w:t xml:space="preserve">  Frequent teacher check-ins / 1:1 breakout support</w:t>
-            </w:r>
-          </w:p>
-        </w:tc>
-        <w:tc>
-          <w:tcPr>
-            <w:tcW w:w="5040" w:type="dxa"/>
-            <w:vAlign w:val="top"/>
-          </w:tcPr>
-          <w:p>
-            <w:pPr>
-              <w:spacing w:before="0" w:after="20" w:line="240" w:lineRule="auto"/>
-            </w:pPr>
-            <w:sdt>
-              <w:sdtPr>
-                <w:rPr>
-                  <w:rFonts w:ascii="MS Gothic" w:eastAsia="MS Gothic" w:hAnsi="MS Gothic" w:hint="eastAsia"/>
-                </w:rPr>
-                <w:id w:val="1104"/>
-                <w14:checkbox>
-                  <w14:checked w14:val="0"/>
-                  <w14:checkedState w14:val="2612" w14:font="MS Gothic"/>
-                  <w14:uncheckedState w14:val="2610" w14:font="MS Gothic"/>
-                </w14:checkbox>
-              </w:sdtPr>
-              <w:sdtContent>
-                <w:r>
-                  <w:rPr>
-                    <w:rFonts w:ascii="MS Gothic" w:eastAsia="MS Gothic" w:hAnsi="MS Gothic" w:hint="eastAsia"/>
-                  </w:rPr>
-                  <w:t>☐</w:t>
-                </w:r>
-              </w:sdtContent>
-            </w:sdt>
-            <w:r>
-              <w:rPr>
-                <w:sz w:val="20"/>
-                <w:szCs w:val="20"/>
-              </w:rPr>
-              <w:t xml:space="preserve">  Recorded lessons available for review</w:t>
-            </w:r>
-          </w:p>
-        </w:tc>
-      </w:tr>
-      <w:tr>
-        <w:tc>
-          <w:tcPr>
-            <w:tcW w:w="5040" w:type="dxa"/>
-            <w:vAlign w:val="top"/>
-          </w:tcPr>
-          <w:p>
-            <w:pPr>
-              <w:spacing w:before="0" w:after="20" w:line="240" w:lineRule="auto"/>
-            </w:pPr>
-            <w:sdt>
-              <w:sdtPr>
-                <w:rPr>
-                  <w:rFonts w:ascii="MS Gothic" w:eastAsia="MS Gothic" w:hAnsi="MS Gothic" w:hint="eastAsia"/>
-                </w:rPr>
                 <w:id w:val="1105"/>
                 <w14:checkbox>
                   <w14:checked w14:val="0"/>
@@ -5292,7 +5384,7 @@
                 <w:sz w:val="20"/>
                 <w:szCs w:val="20"/>
               </w:rPr>
-              <w:t xml:space="preserve">  Chunk tasks into smaller steps</w:t>
+              <w:t xml:space="preserve">  Frequent teacher check-ins / 1:1 breakout support</w:t>
             </w:r>
           </w:p>
         </w:tc>
@@ -5331,7 +5423,7 @@
                 <w:sz w:val="20"/>
                 <w:szCs w:val="20"/>
               </w:rPr>
-              <w:t xml:space="preserve">  On-screen visual timer</w:t>
+              <w:t xml:space="preserve">  Recorded lessons available for review</w:t>
             </w:r>
           </w:p>
         </w:tc>
@@ -5372,7 +5464,7 @@
                 <w:sz w:val="20"/>
                 <w:szCs w:val="20"/>
               </w:rPr>
-              <w:t xml:space="preserve">  Visual schedule / agenda shared on screen</w:t>
+              <w:t xml:space="preserve">  Chunk tasks into smaller steps</w:t>
             </w:r>
           </w:p>
         </w:tc>
@@ -5411,7 +5503,7 @@
                 <w:sz w:val="20"/>
                 <w:szCs w:val="20"/>
               </w:rPr>
-              <w:t xml:space="preserve">  Guided practice (model, then do)</w:t>
+              <w:t xml:space="preserve">  On-screen visual timer</w:t>
             </w:r>
           </w:p>
         </w:tc>
@@ -5452,7 +5544,7 @@
                 <w:sz w:val="20"/>
                 <w:szCs w:val="20"/>
               </w:rPr>
-              <w:t xml:space="preserve">  Screen-share exemplars and models</w:t>
+              <w:t xml:space="preserve">  Visual schedule / agenda shared on screen</w:t>
             </w:r>
           </w:p>
         </w:tc>
@@ -5491,7 +5583,7 @@
                 <w:sz w:val="20"/>
                 <w:szCs w:val="20"/>
               </w:rPr>
-              <w:t xml:space="preserve">  Shared collaborative documents</w:t>
+              <w:t xml:space="preserve">  Guided practice (model, then do)</w:t>
             </w:r>
           </w:p>
         </w:tc>
@@ -5532,7 +5624,7 @@
                 <w:sz w:val="20"/>
                 <w:szCs w:val="20"/>
               </w:rPr>
-              <w:t xml:space="preserve">  Use the chat feature to ask questions</w:t>
+              <w:t xml:space="preserve">  Screen-share exemplars and models</w:t>
             </w:r>
           </w:p>
         </w:tc>
@@ -5571,7 +5663,7 @@
                 <w:sz w:val="20"/>
                 <w:szCs w:val="20"/>
               </w:rPr>
-              <w:t xml:space="preserve">  Pin / spotlight teacher for focus</w:t>
+              <w:t xml:space="preserve">  Shared collaborative documents</w:t>
             </w:r>
           </w:p>
         </w:tc>
@@ -5612,7 +5704,7 @@
                 <w:sz w:val="20"/>
                 <w:szCs w:val="20"/>
               </w:rPr>
-              <w:t xml:space="preserve">  Scheduled movement / brain breaks</w:t>
+              <w:t xml:space="preserve">  Use the chat feature to ask questions</w:t>
             </w:r>
           </w:p>
         </w:tc>
@@ -5651,7 +5743,7 @@
                 <w:sz w:val="20"/>
                 <w:szCs w:val="20"/>
               </w:rPr>
-              <w:t xml:space="preserve">  Sentence starters and writing frames</w:t>
+              <w:t xml:space="preserve">  Pin / spotlight teacher for focus</w:t>
             </w:r>
           </w:p>
         </w:tc>
@@ -5692,7 +5784,7 @@
                 <w:sz w:val="20"/>
                 <w:szCs w:val="20"/>
               </w:rPr>
-              <w:t xml:space="preserve">  Digital graphic organizers</w:t>
+              <w:t xml:space="preserve">  Scheduled movement / brain breaks</w:t>
             </w:r>
           </w:p>
         </w:tc>
@@ -5731,7 +5823,7 @@
                 <w:sz w:val="20"/>
                 <w:szCs w:val="20"/>
               </w:rPr>
-              <w:t xml:space="preserve">  Virtual manipulatives</w:t>
+              <w:t xml:space="preserve">  Sentence starters and writing frames</w:t>
             </w:r>
           </w:p>
         </w:tc>
@@ -5772,7 +5864,7 @@
                 <w:sz w:val="20"/>
                 <w:szCs w:val="20"/>
               </w:rPr>
-              <w:t xml:space="preserve">  Text-to-speech / speech-to-text tools</w:t>
+              <w:t xml:space="preserve">  Digital graphic organizers</w:t>
             </w:r>
           </w:p>
         </w:tc>
@@ -5811,7 +5903,7 @@
                 <w:sz w:val="20"/>
                 <w:szCs w:val="20"/>
               </w:rPr>
-              <w:t xml:space="preserve">  Choice of alternate quiet workspace</w:t>
+              <w:t xml:space="preserve">  Virtual manipulatives</w:t>
             </w:r>
           </w:p>
         </w:tc>
@@ -5852,7 +5944,7 @@
                 <w:sz w:val="20"/>
                 <w:szCs w:val="20"/>
               </w:rPr>
-              <w:t xml:space="preserve">  Extended time on tasks and assessments</w:t>
+              <w:t xml:space="preserve">  Text-to-speech / speech-to-text tools</w:t>
             </w:r>
           </w:p>
         </w:tc>
@@ -5891,7 +5983,7 @@
                 <w:sz w:val="20"/>
                 <w:szCs w:val="20"/>
               </w:rPr>
-              <w:t xml:space="preserve">  Checklists shared digitally</w:t>
+              <w:t xml:space="preserve">  Choice of alternate quiet workspace</w:t>
             </w:r>
           </w:p>
         </w:tc>
@@ -5932,6 +6024,86 @@
                 <w:sz w:val="20"/>
                 <w:szCs w:val="20"/>
               </w:rPr>
+              <w:t xml:space="preserve">  Extended time on tasks and assessments</w:t>
+            </w:r>
+          </w:p>
+        </w:tc>
+        <w:tc>
+          <w:tcPr>
+            <w:tcW w:w="5040" w:type="dxa"/>
+            <w:vAlign w:val="top"/>
+          </w:tcPr>
+          <w:p>
+            <w:pPr>
+              <w:spacing w:before="0" w:after="20" w:line="240" w:lineRule="auto"/>
+            </w:pPr>
+            <w:sdt>
+              <w:sdtPr>
+                <w:rPr>
+                  <w:rFonts w:ascii="MS Gothic" w:eastAsia="MS Gothic" w:hAnsi="MS Gothic" w:hint="eastAsia"/>
+                </w:rPr>
+                <w:id w:val="1122"/>
+                <w14:checkbox>
+                  <w14:checked w14:val="0"/>
+                  <w14:checkedState w14:val="2612" w14:font="MS Gothic"/>
+                  <w14:uncheckedState w14:val="2610" w14:font="MS Gothic"/>
+                </w14:checkbox>
+              </w:sdtPr>
+              <w:sdtContent>
+                <w:r>
+                  <w:rPr>
+                    <w:rFonts w:ascii="MS Gothic" w:eastAsia="MS Gothic" w:hAnsi="MS Gothic" w:hint="eastAsia"/>
+                  </w:rPr>
+                  <w:t>☐</w:t>
+                </w:r>
+              </w:sdtContent>
+            </w:sdt>
+            <w:r>
+              <w:rPr>
+                <w:sz w:val="20"/>
+                <w:szCs w:val="20"/>
+              </w:rPr>
+              <w:t xml:space="preserve">  Checklists shared digitally</w:t>
+            </w:r>
+          </w:p>
+        </w:tc>
+      </w:tr>
+      <w:tr>
+        <w:tc>
+          <w:tcPr>
+            <w:tcW w:w="5040" w:type="dxa"/>
+            <w:vAlign w:val="top"/>
+          </w:tcPr>
+          <w:p>
+            <w:pPr>
+              <w:spacing w:before="0" w:after="20" w:line="240" w:lineRule="auto"/>
+            </w:pPr>
+            <w:sdt>
+              <w:sdtPr>
+                <w:rPr>
+                  <w:rFonts w:ascii="MS Gothic" w:eastAsia="MS Gothic" w:hAnsi="MS Gothic" w:hint="eastAsia"/>
+                </w:rPr>
+                <w:id w:val="1123"/>
+                <w14:checkbox>
+                  <w14:checked w14:val="0"/>
+                  <w14:checkedState w14:val="2612" w14:font="MS Gothic"/>
+                  <w14:uncheckedState w14:val="2610" w14:font="MS Gothic"/>
+                </w14:checkbox>
+              </w:sdtPr>
+              <w:sdtContent>
+                <w:r>
+                  <w:rPr>
+                    <w:rFonts w:ascii="MS Gothic" w:eastAsia="MS Gothic" w:hAnsi="MS Gothic" w:hint="eastAsia"/>
+                  </w:rPr>
+                  <w:t>☐</w:t>
+                </w:r>
+              </w:sdtContent>
+            </w:sdt>
+            <w:r>
+              <w:rPr>
+                <w:sz w:val="20"/>
+                <w:szCs w:val="20"/>
+              </w:rPr>
               <w:t xml:space="preserve">  Frequent, specific positive feedback / praise</w:t>
             </w:r>
           </w:p>
@@ -5950,7 +6122,7 @@
                 <w:rPr>
                   <w:rFonts w:ascii="MS Gothic" w:eastAsia="MS Gothic" w:hAnsi="MS Gothic" w:hint="eastAsia"/>
                 </w:rPr>
-                <w:id w:val="1122"/>
+                <w:id w:val="1124"/>
                 <w14:checkbox>
                   <w14:checked w14:val="0"/>
                   <w14:checkedState w14:val="2612" w14:font="MS Gothic"/>
@@ -6013,7 +6185,7 @@
         <w:tc>
           <w:tcPr>
             <w:tcW w:w="4600" w:type="dxa"/>
-            <w:shd w:val="clear" w:color="auto" w:fill="DCE6F1"/>
+            <w:shd w:val="clear" w:color="auto" w:fill="DCE6EA"/>
             <w:vAlign w:val="top"/>
           </w:tcPr>
           <w:p>
@@ -6023,6 +6195,7 @@
             <w:r>
               <w:rPr>
                 <w:b/>
+                <w:color w:val="003344"/>
                 <w:sz w:val="20"/>
                 <w:szCs w:val="20"/>
               </w:rPr>
@@ -6033,7 +6206,7 @@
         <w:tc>
           <w:tcPr>
             <w:tcW w:w="2740" w:type="dxa"/>
-            <w:shd w:val="clear" w:color="auto" w:fill="DCE6F1"/>
+            <w:shd w:val="clear" w:color="auto" w:fill="DCE6EA"/>
             <w:vAlign w:val="top"/>
           </w:tcPr>
           <w:p>
@@ -6043,6 +6216,7 @@
             <w:r>
               <w:rPr>
                 <w:b/>
+                <w:color w:val="003344"/>
                 <w:sz w:val="20"/>
                 <w:szCs w:val="20"/>
               </w:rPr>
@@ -6053,7 +6227,7 @@
         <w:tc>
           <w:tcPr>
             <w:tcW w:w="2740" w:type="dxa"/>
-            <w:shd w:val="clear" w:color="auto" w:fill="DCE6F1"/>
+            <w:shd w:val="clear" w:color="auto" w:fill="DCE6EA"/>
             <w:vAlign w:val="top"/>
           </w:tcPr>
           <w:p>
@@ -6063,6 +6237,7 @@
             <w:r>
               <w:rPr>
                 <w:b/>
+                <w:color w:val="003344"/>
                 <w:sz w:val="20"/>
                 <w:szCs w:val="20"/>
               </w:rPr>
@@ -6096,7 +6271,7 @@
                 </w:rPr>
                 <w:alias w:val="By Nov 2025, objective"/>
                 <w:tag w:val="By Nov 2025, objective"/>
-                <w:id w:val="1123"/>
+                <w:id w:val="1125"/>
                 <w:placeholder>
                   <w:docPart w:val="DefaultPlaceholder_-1854013440"/>
                 </w:placeholder>
@@ -6130,7 +6305,7 @@
                 </w:rPr>
                 <w:alias w:val="Assessment Procedure"/>
                 <w:tag w:val="Assessment Procedure"/>
-                <w:id w:val="1124"/>
+                <w:id w:val="1126"/>
                 <w:placeholder>
                   <w:docPart w:val="DefaultPlaceholder_-1854013440"/>
                 </w:placeholder>
@@ -6164,7 +6339,7 @@
                 </w:rPr>
                 <w:alias w:val="Review Comments"/>
                 <w:tag w:val="Review Comments"/>
-                <w:id w:val="1125"/>
+                <w:id w:val="1127"/>
                 <w:placeholder>
                   <w:docPart w:val="DefaultPlaceholder_-1854013440"/>
                 </w:placeholder>
@@ -6208,7 +6383,7 @@
                 </w:rPr>
                 <w:alias w:val="By March 2026, objective"/>
                 <w:tag w:val="By March 2026, objective"/>
-                <w:id w:val="1126"/>
+                <w:id w:val="1128"/>
                 <w:placeholder>
                   <w:docPart w:val="DefaultPlaceholder_-1854013440"/>
                 </w:placeholder>
@@ -6242,7 +6417,7 @@
                 </w:rPr>
                 <w:alias w:val="Assessment Procedure"/>
                 <w:tag w:val="Assessment Procedure"/>
-                <w:id w:val="1127"/>
+                <w:id w:val="1129"/>
                 <w:placeholder>
                   <w:docPart w:val="DefaultPlaceholder_-1854013440"/>
                 </w:placeholder>
@@ -6276,7 +6451,7 @@
                 </w:rPr>
                 <w:alias w:val="Review Comments"/>
                 <w:tag w:val="Review Comments"/>
-                <w:id w:val="1128"/>
+                <w:id w:val="1130"/>
                 <w:placeholder>
                   <w:docPart w:val="DefaultPlaceholder_-1854013440"/>
                 </w:placeholder>
@@ -6320,7 +6495,7 @@
                 </w:rPr>
                 <w:alias w:val="By June 2026, objective"/>
                 <w:tag w:val="By June 2026, objective"/>
-                <w:id w:val="1129"/>
+                <w:id w:val="1131"/>
                 <w:placeholder>
                   <w:docPart w:val="DefaultPlaceholder_-1854013440"/>
                 </w:placeholder>
@@ -6354,7 +6529,7 @@
                 </w:rPr>
                 <w:alias w:val="Assessment Procedure"/>
                 <w:tag w:val="Assessment Procedure"/>
-                <w:id w:val="1130"/>
+                <w:id w:val="1132"/>
                 <w:placeholder>
                   <w:docPart w:val="DefaultPlaceholder_-1854013440"/>
                 </w:placeholder>
@@ -6388,7 +6563,7 @@
                 </w:rPr>
                 <w:alias w:val="Review Comments"/>
                 <w:tag w:val="Review Comments"/>
-                <w:id w:val="1131"/>
+                <w:id w:val="1133"/>
                 <w:placeholder>
                   <w:docPart w:val="DefaultPlaceholder_-1854013440"/>
                 </w:placeholder>
@@ -6415,8 +6590,8 @@
     </w:p>
     <w:p>
       <w:pPr>
-        <w:shd w:val="clear" w:color="auto" w:fill="2E5A87"/>
-        <w:spacing w:before="120" w:after="60" w:line="240" w:lineRule="auto"/>
+        <w:shd w:val="clear" w:color="auto" w:fill="003344"/>
+        <w:spacing w:before="140" w:after="60" w:line="240" w:lineRule="auto"/>
       </w:pPr>
       <w:r>
         <w:rPr>
@@ -6430,7 +6605,7 @@
     </w:p>
     <w:p>
       <w:pPr>
-        <w:shd w:val="clear" w:color="auto" w:fill="EEF3F9"/>
+        <w:shd w:val="clear" w:color="auto" w:fill="FBEAD9"/>
         <w:spacing w:before="40" w:after="80" w:line="240" w:lineRule="auto"/>
       </w:pPr>
       <w:r>
@@ -6448,7 +6623,7 @@
           </w:rPr>
           <w:alias w:val="Goal 2 - By (date)"/>
           <w:tag w:val="Goal 2 - By (date)"/>
-          <w:id w:val="1132"/>
+          <w:id w:val="1134"/>
           <w:placeholder>
             <w:docPart w:val="DefaultPlaceholder_-1854013440"/>
           </w:placeholder>
@@ -6478,7 +6653,7 @@
           </w:rPr>
           <w:alias w:val="Goal 2 - Student"/>
           <w:tag w:val="Goal 2 - Student"/>
-          <w:id w:val="1133"/>
+          <w:id w:val="1135"/>
           <w:placeholder>
             <w:docPart w:val="DefaultPlaceholder_-1854013440"/>
           </w:placeholder>
@@ -6508,7 +6683,7 @@
           </w:rPr>
           <w:alias w:val="Goal 2 - Topic"/>
           <w:tag w:val="Goal 2 - Topic"/>
-          <w:id w:val="1134"/>
+          <w:id w:val="1136"/>
           <w:placeholder>
             <w:docPart w:val="DefaultPlaceholder_-1854013440"/>
           </w:placeholder>
@@ -6548,7 +6723,7 @@
           </w:rPr>
           <w:alias w:val="Goal 2 - Detail"/>
           <w:tag w:val="Goal 2 - Detail"/>
-          <w:id w:val="1135"/>
+          <w:id w:val="1137"/>
           <w:placeholder>
             <w:docPart w:val="DefaultPlaceholder_-1854013440"/>
           </w:placeholder>
@@ -6587,7 +6762,7 @@
       <w:r>
         <w:rPr>
           <w:b/>
-          <w:color w:val="2E5A87"/>
+          <w:color w:val="003344"/>
           <w:sz w:val="20"/>
           <w:szCs w:val="20"/>
         </w:rPr>
@@ -6632,86 +6807,6 @@
                 <w:rPr>
                   <w:rFonts w:ascii="MS Gothic" w:eastAsia="MS Gothic" w:hAnsi="MS Gothic" w:hint="eastAsia"/>
                 </w:rPr>
-                <w:id w:val="1136"/>
-                <w14:checkbox>
-                  <w14:checked w14:val="0"/>
-                  <w14:checkedState w14:val="2612" w14:font="MS Gothic"/>
-                  <w14:uncheckedState w14:val="2610" w14:font="MS Gothic"/>
-                </w14:checkbox>
-              </w:sdtPr>
-              <w:sdtContent>
-                <w:r>
-                  <w:rPr>
-                    <w:rFonts w:ascii="MS Gothic" w:eastAsia="MS Gothic" w:hAnsi="MS Gothic" w:hint="eastAsia"/>
-                  </w:rPr>
-                  <w:t>☐</w:t>
-                </w:r>
-              </w:sdtContent>
-            </w:sdt>
-            <w:r>
-              <w:rPr>
-                <w:sz w:val="20"/>
-                <w:szCs w:val="20"/>
-              </w:rPr>
-              <w:t xml:space="preserve">  Frequent teacher check-ins / 1:1 breakout support</w:t>
-            </w:r>
-          </w:p>
-        </w:tc>
-        <w:tc>
-          <w:tcPr>
-            <w:tcW w:w="5040" w:type="dxa"/>
-            <w:vAlign w:val="top"/>
-          </w:tcPr>
-          <w:p>
-            <w:pPr>
-              <w:spacing w:before="0" w:after="20" w:line="240" w:lineRule="auto"/>
-            </w:pPr>
-            <w:sdt>
-              <w:sdtPr>
-                <w:rPr>
-                  <w:rFonts w:ascii="MS Gothic" w:eastAsia="MS Gothic" w:hAnsi="MS Gothic" w:hint="eastAsia"/>
-                </w:rPr>
-                <w:id w:val="1137"/>
-                <w14:checkbox>
-                  <w14:checked w14:val="0"/>
-                  <w14:checkedState w14:val="2612" w14:font="MS Gothic"/>
-                  <w14:uncheckedState w14:val="2610" w14:font="MS Gothic"/>
-                </w14:checkbox>
-              </w:sdtPr>
-              <w:sdtContent>
-                <w:r>
-                  <w:rPr>
-                    <w:rFonts w:ascii="MS Gothic" w:eastAsia="MS Gothic" w:hAnsi="MS Gothic" w:hint="eastAsia"/>
-                  </w:rPr>
-                  <w:t>☐</w:t>
-                </w:r>
-              </w:sdtContent>
-            </w:sdt>
-            <w:r>
-              <w:rPr>
-                <w:sz w:val="20"/>
-                <w:szCs w:val="20"/>
-              </w:rPr>
-              <w:t xml:space="preserve">  Recorded lessons available for review</w:t>
-            </w:r>
-          </w:p>
-        </w:tc>
-      </w:tr>
-      <w:tr>
-        <w:tc>
-          <w:tcPr>
-            <w:tcW w:w="5040" w:type="dxa"/>
-            <w:vAlign w:val="top"/>
-          </w:tcPr>
-          <w:p>
-            <w:pPr>
-              <w:spacing w:before="0" w:after="20" w:line="240" w:lineRule="auto"/>
-            </w:pPr>
-            <w:sdt>
-              <w:sdtPr>
-                <w:rPr>
-                  <w:rFonts w:ascii="MS Gothic" w:eastAsia="MS Gothic" w:hAnsi="MS Gothic" w:hint="eastAsia"/>
-                </w:rPr>
                 <w:id w:val="1138"/>
                 <w14:checkbox>
                   <w14:checked w14:val="0"/>
@@ -6733,7 +6828,7 @@
                 <w:sz w:val="20"/>
                 <w:szCs w:val="20"/>
               </w:rPr>
-              <w:t xml:space="preserve">  Chunk tasks into smaller steps</w:t>
+              <w:t xml:space="preserve">  Frequent teacher check-ins / 1:1 breakout support</w:t>
             </w:r>
           </w:p>
         </w:tc>
@@ -6772,7 +6867,7 @@
                 <w:sz w:val="20"/>
                 <w:szCs w:val="20"/>
               </w:rPr>
-              <w:t xml:space="preserve">  On-screen visual timer</w:t>
+              <w:t xml:space="preserve">  Recorded lessons available for review</w:t>
             </w:r>
           </w:p>
         </w:tc>
@@ -6813,7 +6908,7 @@
                 <w:sz w:val="20"/>
                 <w:szCs w:val="20"/>
               </w:rPr>
-              <w:t xml:space="preserve">  Visual schedule / agenda shared on screen</w:t>
+              <w:t xml:space="preserve">  Chunk tasks into smaller steps</w:t>
             </w:r>
           </w:p>
         </w:tc>
@@ -6852,7 +6947,7 @@
                 <w:sz w:val="20"/>
                 <w:szCs w:val="20"/>
               </w:rPr>
-              <w:t xml:space="preserve">  Guided practice (model, then do)</w:t>
+              <w:t xml:space="preserve">  On-screen visual timer</w:t>
             </w:r>
           </w:p>
         </w:tc>
@@ -6893,7 +6988,7 @@
                 <w:sz w:val="20"/>
                 <w:szCs w:val="20"/>
               </w:rPr>
-              <w:t xml:space="preserve">  Screen-share exemplars and models</w:t>
+              <w:t xml:space="preserve">  Visual schedule / agenda shared on screen</w:t>
             </w:r>
           </w:p>
         </w:tc>
@@ -6932,7 +7027,7 @@
                 <w:sz w:val="20"/>
                 <w:szCs w:val="20"/>
               </w:rPr>
-              <w:t xml:space="preserve">  Shared collaborative documents</w:t>
+              <w:t xml:space="preserve">  Guided practice (model, then do)</w:t>
             </w:r>
           </w:p>
         </w:tc>
@@ -6973,7 +7068,7 @@
                 <w:sz w:val="20"/>
                 <w:szCs w:val="20"/>
               </w:rPr>
-              <w:t xml:space="preserve">  Use the chat feature to ask questions</w:t>
+              <w:t xml:space="preserve">  Screen-share exemplars and models</w:t>
             </w:r>
           </w:p>
         </w:tc>
@@ -7012,7 +7107,7 @@
                 <w:sz w:val="20"/>
                 <w:szCs w:val="20"/>
               </w:rPr>
-              <w:t xml:space="preserve">  Pin / spotlight teacher for focus</w:t>
+              <w:t xml:space="preserve">  Shared collaborative documents</w:t>
             </w:r>
           </w:p>
         </w:tc>
@@ -7053,7 +7148,7 @@
                 <w:sz w:val="20"/>
                 <w:szCs w:val="20"/>
               </w:rPr>
-              <w:t xml:space="preserve">  Scheduled movement / brain breaks</w:t>
+              <w:t xml:space="preserve">  Use the chat feature to ask questions</w:t>
             </w:r>
           </w:p>
         </w:tc>
@@ -7092,7 +7187,7 @@
                 <w:sz w:val="20"/>
                 <w:szCs w:val="20"/>
               </w:rPr>
-              <w:t xml:space="preserve">  Sentence starters and writing frames</w:t>
+              <w:t xml:space="preserve">  Pin / spotlight teacher for focus</w:t>
             </w:r>
           </w:p>
         </w:tc>
@@ -7133,7 +7228,7 @@
                 <w:sz w:val="20"/>
                 <w:szCs w:val="20"/>
               </w:rPr>
-              <w:t xml:space="preserve">  Digital graphic organizers</w:t>
+              <w:t xml:space="preserve">  Scheduled movement / brain breaks</w:t>
             </w:r>
           </w:p>
         </w:tc>
@@ -7172,7 +7267,7 @@
                 <w:sz w:val="20"/>
                 <w:szCs w:val="20"/>
               </w:rPr>
-              <w:t xml:space="preserve">  Virtual manipulatives</w:t>
+              <w:t xml:space="preserve">  Sentence starters and writing frames</w:t>
             </w:r>
           </w:p>
         </w:tc>
@@ -7213,7 +7308,7 @@
                 <w:sz w:val="20"/>
                 <w:szCs w:val="20"/>
               </w:rPr>
-              <w:t xml:space="preserve">  Text-to-speech / speech-to-text tools</w:t>
+              <w:t xml:space="preserve">  Digital graphic organizers</w:t>
             </w:r>
           </w:p>
         </w:tc>
@@ -7252,7 +7347,7 @@
                 <w:sz w:val="20"/>
                 <w:szCs w:val="20"/>
               </w:rPr>
-              <w:t xml:space="preserve">  Choice of alternate quiet workspace</w:t>
+              <w:t xml:space="preserve">  Virtual manipulatives</w:t>
             </w:r>
           </w:p>
         </w:tc>
@@ -7293,7 +7388,7 @@
                 <w:sz w:val="20"/>
                 <w:szCs w:val="20"/>
               </w:rPr>
-              <w:t xml:space="preserve">  Extended time on tasks and assessments</w:t>
+              <w:t xml:space="preserve">  Text-to-speech / speech-to-text tools</w:t>
             </w:r>
           </w:p>
         </w:tc>
@@ -7332,7 +7427,7 @@
                 <w:sz w:val="20"/>
                 <w:szCs w:val="20"/>
               </w:rPr>
-              <w:t xml:space="preserve">  Checklists shared digitally</w:t>
+              <w:t xml:space="preserve">  Choice of alternate quiet workspace</w:t>
             </w:r>
           </w:p>
         </w:tc>
@@ -7373,6 +7468,86 @@
                 <w:sz w:val="20"/>
                 <w:szCs w:val="20"/>
               </w:rPr>
+              <w:t xml:space="preserve">  Extended time on tasks and assessments</w:t>
+            </w:r>
+          </w:p>
+        </w:tc>
+        <w:tc>
+          <w:tcPr>
+            <w:tcW w:w="5040" w:type="dxa"/>
+            <w:vAlign w:val="top"/>
+          </w:tcPr>
+          <w:p>
+            <w:pPr>
+              <w:spacing w:before="0" w:after="20" w:line="240" w:lineRule="auto"/>
+            </w:pPr>
+            <w:sdt>
+              <w:sdtPr>
+                <w:rPr>
+                  <w:rFonts w:ascii="MS Gothic" w:eastAsia="MS Gothic" w:hAnsi="MS Gothic" w:hint="eastAsia"/>
+                </w:rPr>
+                <w:id w:val="1155"/>
+                <w14:checkbox>
+                  <w14:checked w14:val="0"/>
+                  <w14:checkedState w14:val="2612" w14:font="MS Gothic"/>
+                  <w14:uncheckedState w14:val="2610" w14:font="MS Gothic"/>
+                </w14:checkbox>
+              </w:sdtPr>
+              <w:sdtContent>
+                <w:r>
+                  <w:rPr>
+                    <w:rFonts w:ascii="MS Gothic" w:eastAsia="MS Gothic" w:hAnsi="MS Gothic" w:hint="eastAsia"/>
+                  </w:rPr>
+                  <w:t>☐</w:t>
+                </w:r>
+              </w:sdtContent>
+            </w:sdt>
+            <w:r>
+              <w:rPr>
+                <w:sz w:val="20"/>
+                <w:szCs w:val="20"/>
+              </w:rPr>
+              <w:t xml:space="preserve">  Checklists shared digitally</w:t>
+            </w:r>
+          </w:p>
+        </w:tc>
+      </w:tr>
+      <w:tr>
+        <w:tc>
+          <w:tcPr>
+            <w:tcW w:w="5040" w:type="dxa"/>
+            <w:vAlign w:val="top"/>
+          </w:tcPr>
+          <w:p>
+            <w:pPr>
+              <w:spacing w:before="0" w:after="20" w:line="240" w:lineRule="auto"/>
+            </w:pPr>
+            <w:sdt>
+              <w:sdtPr>
+                <w:rPr>
+                  <w:rFonts w:ascii="MS Gothic" w:eastAsia="MS Gothic" w:hAnsi="MS Gothic" w:hint="eastAsia"/>
+                </w:rPr>
+                <w:id w:val="1156"/>
+                <w14:checkbox>
+                  <w14:checked w14:val="0"/>
+                  <w14:checkedState w14:val="2612" w14:font="MS Gothic"/>
+                  <w14:uncheckedState w14:val="2610" w14:font="MS Gothic"/>
+                </w14:checkbox>
+              </w:sdtPr>
+              <w:sdtContent>
+                <w:r>
+                  <w:rPr>
+                    <w:rFonts w:ascii="MS Gothic" w:eastAsia="MS Gothic" w:hAnsi="MS Gothic" w:hint="eastAsia"/>
+                  </w:rPr>
+                  <w:t>☐</w:t>
+                </w:r>
+              </w:sdtContent>
+            </w:sdt>
+            <w:r>
+              <w:rPr>
+                <w:sz w:val="20"/>
+                <w:szCs w:val="20"/>
+              </w:rPr>
               <w:t xml:space="preserve">  Frequent, specific positive feedback / praise</w:t>
             </w:r>
           </w:p>
@@ -7391,7 +7566,7 @@
                 <w:rPr>
                   <w:rFonts w:ascii="MS Gothic" w:eastAsia="MS Gothic" w:hAnsi="MS Gothic" w:hint="eastAsia"/>
                 </w:rPr>
-                <w:id w:val="1155"/>
+                <w:id w:val="1157"/>
                 <w14:checkbox>
                   <w14:checked w14:val="0"/>
                   <w14:checkedState w14:val="2612" w14:font="MS Gothic"/>
@@ -7454,7 +7629,7 @@
         <w:tc>
           <w:tcPr>
             <w:tcW w:w="4600" w:type="dxa"/>
-            <w:shd w:val="clear" w:color="auto" w:fill="DCE6F1"/>
+            <w:shd w:val="clear" w:color="auto" w:fill="DCE6EA"/>
             <w:vAlign w:val="top"/>
           </w:tcPr>
           <w:p>
@@ -7464,6 +7639,7 @@
             <w:r>
               <w:rPr>
                 <w:b/>
+                <w:color w:val="003344"/>
                 <w:sz w:val="20"/>
                 <w:szCs w:val="20"/>
               </w:rPr>
@@ -7474,7 +7650,7 @@
         <w:tc>
           <w:tcPr>
             <w:tcW w:w="2740" w:type="dxa"/>
-            <w:shd w:val="clear" w:color="auto" w:fill="DCE6F1"/>
+            <w:shd w:val="clear" w:color="auto" w:fill="DCE6EA"/>
             <w:vAlign w:val="top"/>
           </w:tcPr>
           <w:p>
@@ -7484,6 +7660,7 @@
             <w:r>
               <w:rPr>
                 <w:b/>
+                <w:color w:val="003344"/>
                 <w:sz w:val="20"/>
                 <w:szCs w:val="20"/>
               </w:rPr>
@@ -7494,7 +7671,7 @@
         <w:tc>
           <w:tcPr>
             <w:tcW w:w="2740" w:type="dxa"/>
-            <w:shd w:val="clear" w:color="auto" w:fill="DCE6F1"/>
+            <w:shd w:val="clear" w:color="auto" w:fill="DCE6EA"/>
             <w:vAlign w:val="top"/>
           </w:tcPr>
           <w:p>
@@ -7504,6 +7681,7 @@
             <w:r>
               <w:rPr>
                 <w:b/>
+                <w:color w:val="003344"/>
                 <w:sz w:val="20"/>
                 <w:szCs w:val="20"/>
               </w:rPr>
@@ -7537,7 +7715,7 @@
                 </w:rPr>
                 <w:alias w:val="By Nov 2025, objective"/>
                 <w:tag w:val="By Nov 2025, objective"/>
-                <w:id w:val="1156"/>
+                <w:id w:val="1158"/>
                 <w:placeholder>
                   <w:docPart w:val="DefaultPlaceholder_-1854013440"/>
                 </w:placeholder>
@@ -7571,7 +7749,7 @@
                 </w:rPr>
                 <w:alias w:val="Assessment Procedure"/>
                 <w:tag w:val="Assessment Procedure"/>
-                <w:id w:val="1157"/>
+                <w:id w:val="1159"/>
                 <w:placeholder>
                   <w:docPart w:val="DefaultPlaceholder_-1854013440"/>
                 </w:placeholder>
@@ -7605,7 +7783,7 @@
                 </w:rPr>
                 <w:alias w:val="Review Comments"/>
                 <w:tag w:val="Review Comments"/>
-                <w:id w:val="1158"/>
+                <w:id w:val="1160"/>
                 <w:placeholder>
                   <w:docPart w:val="DefaultPlaceholder_-1854013440"/>
                 </w:placeholder>
@@ -7649,7 +7827,7 @@
                 </w:rPr>
                 <w:alias w:val="By March 2026, objective"/>
                 <w:tag w:val="By March 2026, objective"/>
-                <w:id w:val="1159"/>
+                <w:id w:val="1161"/>
                 <w:placeholder>
                   <w:docPart w:val="DefaultPlaceholder_-1854013440"/>
                 </w:placeholder>
@@ -7683,7 +7861,7 @@
                 </w:rPr>
                 <w:alias w:val="Assessment Procedure"/>
                 <w:tag w:val="Assessment Procedure"/>
-                <w:id w:val="1160"/>
+                <w:id w:val="1162"/>
                 <w:placeholder>
                   <w:docPart w:val="DefaultPlaceholder_-1854013440"/>
                 </w:placeholder>
@@ -7717,7 +7895,7 @@
                 </w:rPr>
                 <w:alias w:val="Review Comments"/>
                 <w:tag w:val="Review Comments"/>
-                <w:id w:val="1161"/>
+                <w:id w:val="1163"/>
                 <w:placeholder>
                   <w:docPart w:val="DefaultPlaceholder_-1854013440"/>
                 </w:placeholder>
@@ -7761,7 +7939,7 @@
                 </w:rPr>
                 <w:alias w:val="By June 2026, objective"/>
                 <w:tag w:val="By June 2026, objective"/>
-                <w:id w:val="1162"/>
+                <w:id w:val="1164"/>
                 <w:placeholder>
                   <w:docPart w:val="DefaultPlaceholder_-1854013440"/>
                 </w:placeholder>
@@ -7795,7 +7973,7 @@
                 </w:rPr>
                 <w:alias w:val="Assessment Procedure"/>
                 <w:tag w:val="Assessment Procedure"/>
-                <w:id w:val="1163"/>
+                <w:id w:val="1165"/>
                 <w:placeholder>
                   <w:docPart w:val="DefaultPlaceholder_-1854013440"/>
                 </w:placeholder>
@@ -7829,7 +8007,7 @@
                 </w:rPr>
                 <w:alias w:val="Review Comments"/>
                 <w:tag w:val="Review Comments"/>
-                <w:id w:val="1164"/>
+                <w:id w:val="1166"/>
                 <w:placeholder>
                   <w:docPart w:val="DefaultPlaceholder_-1854013440"/>
                 </w:placeholder>
@@ -7856,8 +8034,8 @@
     </w:p>
     <w:p>
       <w:pPr>
-        <w:shd w:val="clear" w:color="auto" w:fill="2E5A87"/>
-        <w:spacing w:before="120" w:after="60" w:line="240" w:lineRule="auto"/>
+        <w:shd w:val="clear" w:color="auto" w:fill="003344"/>
+        <w:spacing w:before="140" w:after="60" w:line="240" w:lineRule="auto"/>
       </w:pPr>
       <w:r>
         <w:rPr>
@@ -7871,7 +8049,7 @@
     </w:p>
     <w:p>
       <w:pPr>
-        <w:shd w:val="clear" w:color="auto" w:fill="EEF3F9"/>
+        <w:shd w:val="clear" w:color="auto" w:fill="FBEAD9"/>
         <w:spacing w:before="40" w:after="80" w:line="240" w:lineRule="auto"/>
       </w:pPr>
       <w:r>
@@ -7889,7 +8067,7 @@
           </w:rPr>
           <w:alias w:val="Goal 3 - By (date)"/>
           <w:tag w:val="Goal 3 - By (date)"/>
-          <w:id w:val="1165"/>
+          <w:id w:val="1167"/>
           <w:placeholder>
             <w:docPart w:val="DefaultPlaceholder_-1854013440"/>
           </w:placeholder>
@@ -7919,7 +8097,7 @@
           </w:rPr>
           <w:alias w:val="Goal 3 - Student"/>
           <w:tag w:val="Goal 3 - Student"/>
-          <w:id w:val="1166"/>
+          <w:id w:val="1168"/>
           <w:placeholder>
             <w:docPart w:val="DefaultPlaceholder_-1854013440"/>
           </w:placeholder>
@@ -7949,7 +8127,7 @@
           </w:rPr>
           <w:alias w:val="Goal 3 - Topic"/>
           <w:tag w:val="Goal 3 - Topic"/>
-          <w:id w:val="1167"/>
+          <w:id w:val="1169"/>
           <w:placeholder>
             <w:docPart w:val="DefaultPlaceholder_-1854013440"/>
           </w:placeholder>
@@ -7989,7 +8167,7 @@
           </w:rPr>
           <w:alias w:val="Goal 3 - Detail"/>
           <w:tag w:val="Goal 3 - Detail"/>
-          <w:id w:val="1168"/>
+          <w:id w:val="1170"/>
           <w:placeholder>
             <w:docPart w:val="DefaultPlaceholder_-1854013440"/>
           </w:placeholder>
@@ -8028,7 +8206,7 @@
       <w:r>
         <w:rPr>
           <w:b/>
-          <w:color w:val="2E5A87"/>
+          <w:color w:val="003344"/>
           <w:sz w:val="20"/>
           <w:szCs w:val="20"/>
         </w:rPr>
@@ -8073,86 +8251,6 @@
                 <w:rPr>
                   <w:rFonts w:ascii="MS Gothic" w:eastAsia="MS Gothic" w:hAnsi="MS Gothic" w:hint="eastAsia"/>
                 </w:rPr>
-                <w:id w:val="1169"/>
-                <w14:checkbox>
-                  <w14:checked w14:val="0"/>
-                  <w14:checkedState w14:val="2612" w14:font="MS Gothic"/>
-                  <w14:uncheckedState w14:val="2610" w14:font="MS Gothic"/>
-                </w14:checkbox>
-              </w:sdtPr>
-              <w:sdtContent>
-                <w:r>
-                  <w:rPr>
-                    <w:rFonts w:ascii="MS Gothic" w:eastAsia="MS Gothic" w:hAnsi="MS Gothic" w:hint="eastAsia"/>
-                  </w:rPr>
-                  <w:t>☐</w:t>
-                </w:r>
-              </w:sdtContent>
-            </w:sdt>
-            <w:r>
-              <w:rPr>
-                <w:sz w:val="20"/>
-                <w:szCs w:val="20"/>
-              </w:rPr>
-              <w:t xml:space="preserve">  Frequent teacher check-ins / 1:1 breakout support</w:t>
-            </w:r>
-          </w:p>
-        </w:tc>
-        <w:tc>
-          <w:tcPr>
-            <w:tcW w:w="5040" w:type="dxa"/>
-            <w:vAlign w:val="top"/>
-          </w:tcPr>
-          <w:p>
-            <w:pPr>
-              <w:spacing w:before="0" w:after="20" w:line="240" w:lineRule="auto"/>
-            </w:pPr>
-            <w:sdt>
-              <w:sdtPr>
-                <w:rPr>
-                  <w:rFonts w:ascii="MS Gothic" w:eastAsia="MS Gothic" w:hAnsi="MS Gothic" w:hint="eastAsia"/>
-                </w:rPr>
-                <w:id w:val="1170"/>
-                <w14:checkbox>
-                  <w14:checked w14:val="0"/>
-                  <w14:checkedState w14:val="2612" w14:font="MS Gothic"/>
-                  <w14:uncheckedState w14:val="2610" w14:font="MS Gothic"/>
-                </w14:checkbox>
-              </w:sdtPr>
-              <w:sdtContent>
-                <w:r>
-                  <w:rPr>
-                    <w:rFonts w:ascii="MS Gothic" w:eastAsia="MS Gothic" w:hAnsi="MS Gothic" w:hint="eastAsia"/>
-                  </w:rPr>
-                  <w:t>☐</w:t>
-                </w:r>
-              </w:sdtContent>
-            </w:sdt>
-            <w:r>
-              <w:rPr>
-                <w:sz w:val="20"/>
-                <w:szCs w:val="20"/>
-              </w:rPr>
-              <w:t xml:space="preserve">  Recorded lessons available for review</w:t>
-            </w:r>
-          </w:p>
-        </w:tc>
-      </w:tr>
-      <w:tr>
-        <w:tc>
-          <w:tcPr>
-            <w:tcW w:w="5040" w:type="dxa"/>
-            <w:vAlign w:val="top"/>
-          </w:tcPr>
-          <w:p>
-            <w:pPr>
-              <w:spacing w:before="0" w:after="20" w:line="240" w:lineRule="auto"/>
-            </w:pPr>
-            <w:sdt>
-              <w:sdtPr>
-                <w:rPr>
-                  <w:rFonts w:ascii="MS Gothic" w:eastAsia="MS Gothic" w:hAnsi="MS Gothic" w:hint="eastAsia"/>
-                </w:rPr>
                 <w:id w:val="1171"/>
                 <w14:checkbox>
                   <w14:checked w14:val="0"/>
@@ -8174,7 +8272,7 @@
                 <w:sz w:val="20"/>
                 <w:szCs w:val="20"/>
               </w:rPr>
-              <w:t xml:space="preserve">  Chunk tasks into smaller steps</w:t>
+              <w:t xml:space="preserve">  Frequent teacher check-ins / 1:1 breakout support</w:t>
             </w:r>
           </w:p>
         </w:tc>
@@ -8213,7 +8311,7 @@
                 <w:sz w:val="20"/>
                 <w:szCs w:val="20"/>
               </w:rPr>
-              <w:t xml:space="preserve">  On-screen visual timer</w:t>
+              <w:t xml:space="preserve">  Recorded lessons available for review</w:t>
             </w:r>
           </w:p>
         </w:tc>
@@ -8254,7 +8352,7 @@
                 <w:sz w:val="20"/>
                 <w:szCs w:val="20"/>
               </w:rPr>
-              <w:t xml:space="preserve">  Visual schedule / agenda shared on screen</w:t>
+              <w:t xml:space="preserve">  Chunk tasks into smaller steps</w:t>
             </w:r>
           </w:p>
         </w:tc>
@@ -8293,7 +8391,7 @@
                 <w:sz w:val="20"/>
                 <w:szCs w:val="20"/>
               </w:rPr>
-              <w:t xml:space="preserve">  Guided practice (model, then do)</w:t>
+              <w:t xml:space="preserve">  On-screen visual timer</w:t>
             </w:r>
           </w:p>
         </w:tc>
@@ -8334,7 +8432,7 @@
                 <w:sz w:val="20"/>
                 <w:szCs w:val="20"/>
               </w:rPr>
-              <w:t xml:space="preserve">  Screen-share exemplars and models</w:t>
+              <w:t xml:space="preserve">  Visual schedule / agenda shared on screen</w:t>
             </w:r>
           </w:p>
         </w:tc>
@@ -8373,7 +8471,7 @@
                 <w:sz w:val="20"/>
                 <w:szCs w:val="20"/>
               </w:rPr>
-              <w:t xml:space="preserve">  Shared collaborative documents</w:t>
+              <w:t xml:space="preserve">  Guided practice (model, then do)</w:t>
             </w:r>
           </w:p>
         </w:tc>
@@ -8414,7 +8512,7 @@
                 <w:sz w:val="20"/>
                 <w:szCs w:val="20"/>
               </w:rPr>
-              <w:t xml:space="preserve">  Use the chat feature to ask questions</w:t>
+              <w:t xml:space="preserve">  Screen-share exemplars and models</w:t>
             </w:r>
           </w:p>
         </w:tc>
@@ -8453,7 +8551,7 @@
                 <w:sz w:val="20"/>
                 <w:szCs w:val="20"/>
               </w:rPr>
-              <w:t xml:space="preserve">  Pin / spotlight teacher for focus</w:t>
+              <w:t xml:space="preserve">  Shared collaborative documents</w:t>
             </w:r>
           </w:p>
         </w:tc>
@@ -8494,7 +8592,7 @@
                 <w:sz w:val="20"/>
                 <w:szCs w:val="20"/>
               </w:rPr>
-              <w:t xml:space="preserve">  Scheduled movement / brain breaks</w:t>
+              <w:t xml:space="preserve">  Use the chat feature to ask questions</w:t>
             </w:r>
           </w:p>
         </w:tc>
@@ -8533,7 +8631,7 @@
                 <w:sz w:val="20"/>
                 <w:szCs w:val="20"/>
               </w:rPr>
-              <w:t xml:space="preserve">  Sentence starters and writing frames</w:t>
+              <w:t xml:space="preserve">  Pin / spotlight teacher for focus</w:t>
             </w:r>
           </w:p>
         </w:tc>
@@ -8574,7 +8672,7 @@
                 <w:sz w:val="20"/>
                 <w:szCs w:val="20"/>
               </w:rPr>
-              <w:t xml:space="preserve">  Digital graphic organizers</w:t>
+              <w:t xml:space="preserve">  Scheduled movement / brain breaks</w:t>
             </w:r>
           </w:p>
         </w:tc>
@@ -8613,7 +8711,7 @@
                 <w:sz w:val="20"/>
                 <w:szCs w:val="20"/>
               </w:rPr>
-              <w:t xml:space="preserve">  Virtual manipulatives</w:t>
+              <w:t xml:space="preserve">  Sentence starters and writing frames</w:t>
             </w:r>
           </w:p>
         </w:tc>
@@ -8654,7 +8752,7 @@
                 <w:sz w:val="20"/>
                 <w:szCs w:val="20"/>
               </w:rPr>
-              <w:t xml:space="preserve">  Text-to-speech / speech-to-text tools</w:t>
+              <w:t xml:space="preserve">  Digital graphic organizers</w:t>
             </w:r>
           </w:p>
         </w:tc>
@@ -8693,7 +8791,7 @@
                 <w:sz w:val="20"/>
                 <w:szCs w:val="20"/>
               </w:rPr>
-              <w:t xml:space="preserve">  Choice of alternate quiet workspace</w:t>
+              <w:t xml:space="preserve">  Virtual manipulatives</w:t>
             </w:r>
           </w:p>
         </w:tc>
@@ -8734,7 +8832,7 @@
                 <w:sz w:val="20"/>
                 <w:szCs w:val="20"/>
               </w:rPr>
-              <w:t xml:space="preserve">  Extended time on tasks and assessments</w:t>
+              <w:t xml:space="preserve">  Text-to-speech / speech-to-text tools</w:t>
             </w:r>
           </w:p>
         </w:tc>
@@ -8773,7 +8871,7 @@
                 <w:sz w:val="20"/>
                 <w:szCs w:val="20"/>
               </w:rPr>
-              <w:t xml:space="preserve">  Checklists shared digitally</w:t>
+              <w:t xml:space="preserve">  Choice of alternate quiet workspace</w:t>
             </w:r>
           </w:p>
         </w:tc>
@@ -8814,6 +8912,86 @@
                 <w:sz w:val="20"/>
                 <w:szCs w:val="20"/>
               </w:rPr>
+              <w:t xml:space="preserve">  Extended time on tasks and assessments</w:t>
+            </w:r>
+          </w:p>
+        </w:tc>
+        <w:tc>
+          <w:tcPr>
+            <w:tcW w:w="5040" w:type="dxa"/>
+            <w:vAlign w:val="top"/>
+          </w:tcPr>
+          <w:p>
+            <w:pPr>
+              <w:spacing w:before="0" w:after="20" w:line="240" w:lineRule="auto"/>
+            </w:pPr>
+            <w:sdt>
+              <w:sdtPr>
+                <w:rPr>
+                  <w:rFonts w:ascii="MS Gothic" w:eastAsia="MS Gothic" w:hAnsi="MS Gothic" w:hint="eastAsia"/>
+                </w:rPr>
+                <w:id w:val="1188"/>
+                <w14:checkbox>
+                  <w14:checked w14:val="0"/>
+                  <w14:checkedState w14:val="2612" w14:font="MS Gothic"/>
+                  <w14:uncheckedState w14:val="2610" w14:font="MS Gothic"/>
+                </w14:checkbox>
+              </w:sdtPr>
+              <w:sdtContent>
+                <w:r>
+                  <w:rPr>
+                    <w:rFonts w:ascii="MS Gothic" w:eastAsia="MS Gothic" w:hAnsi="MS Gothic" w:hint="eastAsia"/>
+                  </w:rPr>
+                  <w:t>☐</w:t>
+                </w:r>
+              </w:sdtContent>
+            </w:sdt>
+            <w:r>
+              <w:rPr>
+                <w:sz w:val="20"/>
+                <w:szCs w:val="20"/>
+              </w:rPr>
+              <w:t xml:space="preserve">  Checklists shared digitally</w:t>
+            </w:r>
+          </w:p>
+        </w:tc>
+      </w:tr>
+      <w:tr>
+        <w:tc>
+          <w:tcPr>
+            <w:tcW w:w="5040" w:type="dxa"/>
+            <w:vAlign w:val="top"/>
+          </w:tcPr>
+          <w:p>
+            <w:pPr>
+              <w:spacing w:before="0" w:after="20" w:line="240" w:lineRule="auto"/>
+            </w:pPr>
+            <w:sdt>
+              <w:sdtPr>
+                <w:rPr>
+                  <w:rFonts w:ascii="MS Gothic" w:eastAsia="MS Gothic" w:hAnsi="MS Gothic" w:hint="eastAsia"/>
+                </w:rPr>
+                <w:id w:val="1189"/>
+                <w14:checkbox>
+                  <w14:checked w14:val="0"/>
+                  <w14:checkedState w14:val="2612" w14:font="MS Gothic"/>
+                  <w14:uncheckedState w14:val="2610" w14:font="MS Gothic"/>
+                </w14:checkbox>
+              </w:sdtPr>
+              <w:sdtContent>
+                <w:r>
+                  <w:rPr>
+                    <w:rFonts w:ascii="MS Gothic" w:eastAsia="MS Gothic" w:hAnsi="MS Gothic" w:hint="eastAsia"/>
+                  </w:rPr>
+                  <w:t>☐</w:t>
+                </w:r>
+              </w:sdtContent>
+            </w:sdt>
+            <w:r>
+              <w:rPr>
+                <w:sz w:val="20"/>
+                <w:szCs w:val="20"/>
+              </w:rPr>
               <w:t xml:space="preserve">  Frequent, specific positive feedback / praise</w:t>
             </w:r>
           </w:p>
@@ -8832,7 +9010,7 @@
                 <w:rPr>
                   <w:rFonts w:ascii="MS Gothic" w:eastAsia="MS Gothic" w:hAnsi="MS Gothic" w:hint="eastAsia"/>
                 </w:rPr>
-                <w:id w:val="1188"/>
+                <w:id w:val="1190"/>
                 <w14:checkbox>
                   <w14:checked w14:val="0"/>
                   <w14:checkedState w14:val="2612" w14:font="MS Gothic"/>
@@ -8895,7 +9073,7 @@
         <w:tc>
           <w:tcPr>
             <w:tcW w:w="4600" w:type="dxa"/>
-            <w:shd w:val="clear" w:color="auto" w:fill="DCE6F1"/>
+            <w:shd w:val="clear" w:color="auto" w:fill="DCE6EA"/>
             <w:vAlign w:val="top"/>
           </w:tcPr>
           <w:p>
@@ -8905,6 +9083,7 @@
             <w:r>
               <w:rPr>
                 <w:b/>
+                <w:color w:val="003344"/>
                 <w:sz w:val="20"/>
                 <w:szCs w:val="20"/>
               </w:rPr>
@@ -8915,7 +9094,7 @@
         <w:tc>
           <w:tcPr>
             <w:tcW w:w="2740" w:type="dxa"/>
-            <w:shd w:val="clear" w:color="auto" w:fill="DCE6F1"/>
+            <w:shd w:val="clear" w:color="auto" w:fill="DCE6EA"/>
             <w:vAlign w:val="top"/>
           </w:tcPr>
           <w:p>
@@ -8925,6 +9104,7 @@
             <w:r>
               <w:rPr>
                 <w:b/>
+                <w:color w:val="003344"/>
                 <w:sz w:val="20"/>
                 <w:szCs w:val="20"/>
               </w:rPr>
@@ -8935,7 +9115,7 @@
         <w:tc>
           <w:tcPr>
             <w:tcW w:w="2740" w:type="dxa"/>
-            <w:shd w:val="clear" w:color="auto" w:fill="DCE6F1"/>
+            <w:shd w:val="clear" w:color="auto" w:fill="DCE6EA"/>
             <w:vAlign w:val="top"/>
           </w:tcPr>
           <w:p>
@@ -8945,6 +9125,7 @@
             <w:r>
               <w:rPr>
                 <w:b/>
+                <w:color w:val="003344"/>
                 <w:sz w:val="20"/>
                 <w:szCs w:val="20"/>
               </w:rPr>
@@ -8978,7 +9159,7 @@
                 </w:rPr>
                 <w:alias w:val="By Nov 2025, objective"/>
                 <w:tag w:val="By Nov 2025, objective"/>
-                <w:id w:val="1189"/>
+                <w:id w:val="1191"/>
                 <w:placeholder>
                   <w:docPart w:val="DefaultPlaceholder_-1854013440"/>
                 </w:placeholder>
@@ -9012,7 +9193,7 @@
                 </w:rPr>
                 <w:alias w:val="Assessment Procedure"/>
                 <w:tag w:val="Assessment Procedure"/>
-                <w:id w:val="1190"/>
+                <w:id w:val="1192"/>
                 <w:placeholder>
                   <w:docPart w:val="DefaultPlaceholder_-1854013440"/>
                 </w:placeholder>
@@ -9046,7 +9227,7 @@
                 </w:rPr>
                 <w:alias w:val="Review Comments"/>
                 <w:tag w:val="Review Comments"/>
-                <w:id w:val="1191"/>
+                <w:id w:val="1193"/>
                 <w:placeholder>
                   <w:docPart w:val="DefaultPlaceholder_-1854013440"/>
                 </w:placeholder>
@@ -9090,7 +9271,7 @@
                 </w:rPr>
                 <w:alias w:val="By March 2026, objective"/>
                 <w:tag w:val="By March 2026, objective"/>
-                <w:id w:val="1192"/>
+                <w:id w:val="1194"/>
                 <w:placeholder>
                   <w:docPart w:val="DefaultPlaceholder_-1854013440"/>
                 </w:placeholder>
@@ -9124,7 +9305,7 @@
                 </w:rPr>
                 <w:alias w:val="Assessment Procedure"/>
                 <w:tag w:val="Assessment Procedure"/>
-                <w:id w:val="1193"/>
+                <w:id w:val="1195"/>
                 <w:placeholder>
                   <w:docPart w:val="DefaultPlaceholder_-1854013440"/>
                 </w:placeholder>
@@ -9158,7 +9339,7 @@
                 </w:rPr>
                 <w:alias w:val="Review Comments"/>
                 <w:tag w:val="Review Comments"/>
-                <w:id w:val="1194"/>
+                <w:id w:val="1196"/>
                 <w:placeholder>
                   <w:docPart w:val="DefaultPlaceholder_-1854013440"/>
                 </w:placeholder>
@@ -9202,7 +9383,7 @@
                 </w:rPr>
                 <w:alias w:val="By June 2026, objective"/>
                 <w:tag w:val="By June 2026, objective"/>
-                <w:id w:val="1195"/>
+                <w:id w:val="1197"/>
                 <w:placeholder>
                   <w:docPart w:val="DefaultPlaceholder_-1854013440"/>
                 </w:placeholder>
@@ -9236,7 +9417,7 @@
                 </w:rPr>
                 <w:alias w:val="Assessment Procedure"/>
                 <w:tag w:val="Assessment Procedure"/>
-                <w:id w:val="1196"/>
+                <w:id w:val="1198"/>
                 <w:placeholder>
                   <w:docPart w:val="DefaultPlaceholder_-1854013440"/>
                 </w:placeholder>
@@ -9270,7 +9451,7 @@
                 </w:rPr>
                 <w:alias w:val="Review Comments"/>
                 <w:tag w:val="Review Comments"/>
-                <w:id w:val="1197"/>
+                <w:id w:val="1199"/>
                 <w:placeholder>
                   <w:docPart w:val="DefaultPlaceholder_-1854013440"/>
                 </w:placeholder>
@@ -9297,8 +9478,8 @@
     </w:p>
     <w:p>
       <w:pPr>
-        <w:shd w:val="clear" w:color="auto" w:fill="2E5A87"/>
-        <w:spacing w:before="120" w:after="60" w:line="240" w:lineRule="auto"/>
+        <w:shd w:val="clear" w:color="auto" w:fill="003344"/>
+        <w:spacing w:before="140" w:after="60" w:line="240" w:lineRule="auto"/>
       </w:pPr>
       <w:r>
         <w:rPr>
@@ -9317,7 +9498,7 @@
       <w:r>
         <w:rPr>
           <w:b/>
-          <w:color w:val="2E5A87"/>
+          <w:color w:val="003344"/>
           <w:sz w:val="22"/>
           <w:szCs w:val="22"/>
         </w:rPr>
@@ -9343,7 +9524,7 @@
           </w:rPr>
           <w:alias w:val="Literacy - Long Term Goal"/>
           <w:tag w:val="Literacy - Long Term Goal"/>
-          <w:id w:val="1198"/>
+          <w:id w:val="1200"/>
           <w:placeholder>
             <w:docPart w:val="DefaultPlaceholder_-1854013440"/>
           </w:placeholder>
@@ -9391,7 +9572,7 @@
         <w:tc>
           <w:tcPr>
             <w:tcW w:w="3360" w:type="dxa"/>
-            <w:shd w:val="clear" w:color="auto" w:fill="DCE6F1"/>
+            <w:shd w:val="clear" w:color="auto" w:fill="DCE6EA"/>
             <w:vAlign w:val="top"/>
           </w:tcPr>
           <w:p>
@@ -9401,6 +9582,7 @@
             <w:r>
               <w:rPr>
                 <w:b/>
+                <w:color w:val="003344"/>
                 <w:sz w:val="20"/>
                 <w:szCs w:val="20"/>
               </w:rPr>
@@ -9411,7 +9593,7 @@
         <w:tc>
           <w:tcPr>
             <w:tcW w:w="3360" w:type="dxa"/>
-            <w:shd w:val="clear" w:color="auto" w:fill="DCE6F1"/>
+            <w:shd w:val="clear" w:color="auto" w:fill="DCE6EA"/>
             <w:vAlign w:val="top"/>
           </w:tcPr>
           <w:p>
@@ -9421,6 +9603,7 @@
             <w:r>
               <w:rPr>
                 <w:b/>
+                <w:color w:val="003344"/>
                 <w:sz w:val="20"/>
                 <w:szCs w:val="20"/>
               </w:rPr>
@@ -9431,7 +9614,7 @@
         <w:tc>
           <w:tcPr>
             <w:tcW w:w="3360" w:type="dxa"/>
-            <w:shd w:val="clear" w:color="auto" w:fill="DCE6F1"/>
+            <w:shd w:val="clear" w:color="auto" w:fill="DCE6EA"/>
             <w:vAlign w:val="top"/>
           </w:tcPr>
           <w:p>
@@ -9441,6 +9624,7 @@
             <w:r>
               <w:rPr>
                 <w:b/>
+                <w:color w:val="003344"/>
                 <w:sz w:val="20"/>
                 <w:szCs w:val="20"/>
               </w:rPr>
@@ -9466,7 +9650,7 @@
                 </w:rPr>
                 <w:alias w:val="Literacy November"/>
                 <w:tag w:val="Literacy November"/>
-                <w:id w:val="1199"/>
+                <w:id w:val="1201"/>
                 <w:placeholder>
                   <w:docPart w:val="DefaultPlaceholder_-1854013440"/>
                 </w:placeholder>
@@ -9500,7 +9684,7 @@
                 </w:rPr>
                 <w:alias w:val="Literacy March"/>
                 <w:tag w:val="Literacy March"/>
-                <w:id w:val="1200"/>
+                <w:id w:val="1202"/>
                 <w:placeholder>
                   <w:docPart w:val="DefaultPlaceholder_-1854013440"/>
                 </w:placeholder>
@@ -9534,7 +9718,7 @@
                 </w:rPr>
                 <w:alias w:val="Literacy June"/>
                 <w:tag w:val="Literacy June"/>
-                <w:id w:val="1201"/>
+                <w:id w:val="1203"/>
                 <w:placeholder>
                   <w:docPart w:val="DefaultPlaceholder_-1854013440"/>
                 </w:placeholder>
@@ -9566,7 +9750,7 @@
       <w:r>
         <w:rPr>
           <w:b/>
-          <w:color w:val="2E5A87"/>
+          <w:color w:val="003344"/>
           <w:sz w:val="22"/>
           <w:szCs w:val="22"/>
         </w:rPr>
@@ -9592,7 +9776,7 @@
           </w:rPr>
           <w:alias w:val="Numeracy - Long Term Goal"/>
           <w:tag w:val="Numeracy - Long Term Goal"/>
-          <w:id w:val="1202"/>
+          <w:id w:val="1204"/>
           <w:placeholder>
             <w:docPart w:val="DefaultPlaceholder_-1854013440"/>
           </w:placeholder>
@@ -9640,7 +9824,7 @@
         <w:tc>
           <w:tcPr>
             <w:tcW w:w="3360" w:type="dxa"/>
-            <w:shd w:val="clear" w:color="auto" w:fill="DCE6F1"/>
+            <w:shd w:val="clear" w:color="auto" w:fill="DCE6EA"/>
             <w:vAlign w:val="top"/>
           </w:tcPr>
           <w:p>
@@ -9650,6 +9834,7 @@
             <w:r>
               <w:rPr>
                 <w:b/>
+                <w:color w:val="003344"/>
                 <w:sz w:val="20"/>
                 <w:szCs w:val="20"/>
               </w:rPr>
@@ -9660,7 +9845,7 @@
         <w:tc>
           <w:tcPr>
             <w:tcW w:w="3360" w:type="dxa"/>
-            <w:shd w:val="clear" w:color="auto" w:fill="DCE6F1"/>
+            <w:shd w:val="clear" w:color="auto" w:fill="DCE6EA"/>
             <w:vAlign w:val="top"/>
           </w:tcPr>
           <w:p>
@@ -9670,6 +9855,7 @@
             <w:r>
               <w:rPr>
                 <w:b/>
+                <w:color w:val="003344"/>
                 <w:sz w:val="20"/>
                 <w:szCs w:val="20"/>
               </w:rPr>
@@ -9680,7 +9866,7 @@
         <w:tc>
           <w:tcPr>
             <w:tcW w:w="3360" w:type="dxa"/>
-            <w:shd w:val="clear" w:color="auto" w:fill="DCE6F1"/>
+            <w:shd w:val="clear" w:color="auto" w:fill="DCE6EA"/>
             <w:vAlign w:val="top"/>
           </w:tcPr>
           <w:p>
@@ -9690,6 +9876,7 @@
             <w:r>
               <w:rPr>
                 <w:b/>
+                <w:color w:val="003344"/>
                 <w:sz w:val="20"/>
                 <w:szCs w:val="20"/>
               </w:rPr>
@@ -9715,7 +9902,7 @@
                 </w:rPr>
                 <w:alias w:val="Numeracy November"/>
                 <w:tag w:val="Numeracy November"/>
-                <w:id w:val="1203"/>
+                <w:id w:val="1205"/>
                 <w:placeholder>
                   <w:docPart w:val="DefaultPlaceholder_-1854013440"/>
                 </w:placeholder>
@@ -9749,7 +9936,7 @@
                 </w:rPr>
                 <w:alias w:val="Numeracy March"/>
                 <w:tag w:val="Numeracy March"/>
-                <w:id w:val="1204"/>
+                <w:id w:val="1206"/>
                 <w:placeholder>
                   <w:docPart w:val="DefaultPlaceholder_-1854013440"/>
                 </w:placeholder>
@@ -9783,7 +9970,7 @@
                 </w:rPr>
                 <w:alias w:val="Numeracy June"/>
                 <w:tag w:val="Numeracy June"/>
-                <w:id w:val="1205"/>
+                <w:id w:val="1207"/>
                 <w:placeholder>
                   <w:docPart w:val="DefaultPlaceholder_-1854013440"/>
                 </w:placeholder>
@@ -9815,7 +10002,7 @@
       <w:r>
         <w:rPr>
           <w:b/>
-          <w:color w:val="2E5A87"/>
+          <w:color w:val="003344"/>
           <w:sz w:val="22"/>
           <w:szCs w:val="22"/>
         </w:rPr>
@@ -9841,7 +10028,7 @@
           </w:rPr>
           <w:alias w:val="Therapeutic Services - Long Term Goal"/>
           <w:tag w:val="Therapeutic Services - Long Term Goal"/>
-          <w:id w:val="1206"/>
+          <w:id w:val="1208"/>
           <w:placeholder>
             <w:docPart w:val="DefaultPlaceholder_-1854013440"/>
           </w:placeholder>
@@ -9889,7 +10076,7 @@
         <w:tc>
           <w:tcPr>
             <w:tcW w:w="3360" w:type="dxa"/>
-            <w:shd w:val="clear" w:color="auto" w:fill="DCE6F1"/>
+            <w:shd w:val="clear" w:color="auto" w:fill="DCE6EA"/>
             <w:vAlign w:val="top"/>
           </w:tcPr>
           <w:p>
@@ -9899,6 +10086,7 @@
             <w:r>
               <w:rPr>
                 <w:b/>
+                <w:color w:val="003344"/>
                 <w:sz w:val="20"/>
                 <w:szCs w:val="20"/>
               </w:rPr>
@@ -9909,7 +10097,7 @@
         <w:tc>
           <w:tcPr>
             <w:tcW w:w="3360" w:type="dxa"/>
-            <w:shd w:val="clear" w:color="auto" w:fill="DCE6F1"/>
+            <w:shd w:val="clear" w:color="auto" w:fill="DCE6EA"/>
             <w:vAlign w:val="top"/>
           </w:tcPr>
           <w:p>
@@ -9919,6 +10107,7 @@
             <w:r>
               <w:rPr>
                 <w:b/>
+                <w:color w:val="003344"/>
                 <w:sz w:val="20"/>
                 <w:szCs w:val="20"/>
               </w:rPr>
@@ -9929,7 +10118,7 @@
         <w:tc>
           <w:tcPr>
             <w:tcW w:w="3360" w:type="dxa"/>
-            <w:shd w:val="clear" w:color="auto" w:fill="DCE6F1"/>
+            <w:shd w:val="clear" w:color="auto" w:fill="DCE6EA"/>
             <w:vAlign w:val="top"/>
           </w:tcPr>
           <w:p>
@@ -9939,6 +10128,7 @@
             <w:r>
               <w:rPr>
                 <w:b/>
+                <w:color w:val="003344"/>
                 <w:sz w:val="20"/>
                 <w:szCs w:val="20"/>
               </w:rPr>
@@ -9964,7 +10154,7 @@
                 </w:rPr>
                 <w:alias w:val="Therapeutic Services November"/>
                 <w:tag w:val="Therapeutic Services November"/>
-                <w:id w:val="1207"/>
+                <w:id w:val="1209"/>
                 <w:placeholder>
                   <w:docPart w:val="DefaultPlaceholder_-1854013440"/>
                 </w:placeholder>
@@ -9998,7 +10188,7 @@
                 </w:rPr>
                 <w:alias w:val="Therapeutic Services March"/>
                 <w:tag w:val="Therapeutic Services March"/>
-                <w:id w:val="1208"/>
+                <w:id w:val="1210"/>
                 <w:placeholder>
                   <w:docPart w:val="DefaultPlaceholder_-1854013440"/>
                 </w:placeholder>
@@ -10032,7 +10222,7 @@
                 </w:rPr>
                 <w:alias w:val="Therapeutic Services June"/>
                 <w:tag w:val="Therapeutic Services June"/>
-                <w:id w:val="1209"/>
+                <w:id w:val="1211"/>
                 <w:placeholder>
                   <w:docPart w:val="DefaultPlaceholder_-1854013440"/>
                 </w:placeholder>
@@ -10064,7 +10254,7 @@
       <w:r>
         <w:rPr>
           <w:b/>
-          <w:color w:val="2E5A87"/>
+          <w:color w:val="003344"/>
           <w:sz w:val="22"/>
           <w:szCs w:val="22"/>
         </w:rPr>
@@ -10090,7 +10280,7 @@
           </w:rPr>
           <w:alias w:val="OT / SLP Services - Long Term Goal"/>
           <w:tag w:val="OT / SLP Services - Long Term Goal"/>
-          <w:id w:val="1210"/>
+          <w:id w:val="1212"/>
           <w:placeholder>
             <w:docPart w:val="DefaultPlaceholder_-1854013440"/>
           </w:placeholder>
@@ -10138,7 +10328,7 @@
         <w:tc>
           <w:tcPr>
             <w:tcW w:w="3360" w:type="dxa"/>
-            <w:shd w:val="clear" w:color="auto" w:fill="DCE6F1"/>
+            <w:shd w:val="clear" w:color="auto" w:fill="DCE6EA"/>
             <w:vAlign w:val="top"/>
           </w:tcPr>
           <w:p>
@@ -10148,6 +10338,7 @@
             <w:r>
               <w:rPr>
                 <w:b/>
+                <w:color w:val="003344"/>
                 <w:sz w:val="20"/>
                 <w:szCs w:val="20"/>
               </w:rPr>
@@ -10158,7 +10349,7 @@
         <w:tc>
           <w:tcPr>
             <w:tcW w:w="3360" w:type="dxa"/>
-            <w:shd w:val="clear" w:color="auto" w:fill="DCE6F1"/>
+            <w:shd w:val="clear" w:color="auto" w:fill="DCE6EA"/>
             <w:vAlign w:val="top"/>
           </w:tcPr>
           <w:p>
@@ -10168,6 +10359,7 @@
             <w:r>
               <w:rPr>
                 <w:b/>
+                <w:color w:val="003344"/>
                 <w:sz w:val="20"/>
                 <w:szCs w:val="20"/>
               </w:rPr>
@@ -10178,7 +10370,7 @@
         <w:tc>
           <w:tcPr>
             <w:tcW w:w="3360" w:type="dxa"/>
-            <w:shd w:val="clear" w:color="auto" w:fill="DCE6F1"/>
+            <w:shd w:val="clear" w:color="auto" w:fill="DCE6EA"/>
             <w:vAlign w:val="top"/>
           </w:tcPr>
           <w:p>
@@ -10188,6 +10380,7 @@
             <w:r>
               <w:rPr>
                 <w:b/>
+                <w:color w:val="003344"/>
                 <w:sz w:val="20"/>
                 <w:szCs w:val="20"/>
               </w:rPr>
@@ -10213,7 +10406,7 @@
                 </w:rPr>
                 <w:alias w:val="OT / SLP Services November"/>
                 <w:tag w:val="OT / SLP Services November"/>
-                <w:id w:val="1211"/>
+                <w:id w:val="1213"/>
                 <w:placeholder>
                   <w:docPart w:val="DefaultPlaceholder_-1854013440"/>
                 </w:placeholder>
@@ -10247,7 +10440,7 @@
                 </w:rPr>
                 <w:alias w:val="OT / SLP Services March"/>
                 <w:tag w:val="OT / SLP Services March"/>
-                <w:id w:val="1212"/>
+                <w:id w:val="1214"/>
                 <w:placeholder>
                   <w:docPart w:val="DefaultPlaceholder_-1854013440"/>
                 </w:placeholder>
@@ -10281,7 +10474,7 @@
                 </w:rPr>
                 <w:alias w:val="OT / SLP Services June"/>
                 <w:tag w:val="OT / SLP Services June"/>
-                <w:id w:val="1213"/>
+                <w:id w:val="1215"/>
                 <w:placeholder>
                   <w:docPart w:val="DefaultPlaceholder_-1854013440"/>
                 </w:placeholder>
@@ -10308,8 +10501,8 @@
     </w:p>
     <w:p>
       <w:pPr>
-        <w:shd w:val="clear" w:color="auto" w:fill="2E5A87"/>
-        <w:spacing w:before="120" w:after="60" w:line="240" w:lineRule="auto"/>
+        <w:shd w:val="clear" w:color="auto" w:fill="003344"/>
+        <w:spacing w:before="140" w:after="60" w:line="240" w:lineRule="auto"/>
       </w:pPr>
       <w:r>
         <w:rPr>
@@ -10348,7 +10541,7 @@
         <w:tc>
           <w:tcPr>
             <w:tcW w:w="3600" w:type="dxa"/>
-            <w:shd w:val="clear" w:color="auto" w:fill="DCE6F1"/>
+            <w:shd w:val="clear" w:color="auto" w:fill="DCE6EA"/>
             <w:vAlign w:val="top"/>
           </w:tcPr>
           <w:p>
@@ -10358,6 +10551,7 @@
             <w:r>
               <w:rPr>
                 <w:b/>
+                <w:color w:val="003344"/>
                 <w:sz w:val="20"/>
                 <w:szCs w:val="20"/>
               </w:rPr>
@@ -10381,7 +10575,7 @@
                 </w:rPr>
                 <w:alias w:val="Goals Achieved"/>
                 <w:tag w:val="Goals Achieved"/>
-                <w:id w:val="1214"/>
+                <w:id w:val="1216"/>
                 <w:placeholder>
                   <w:docPart w:val="DefaultPlaceholder_-1854013440"/>
                 </w:placeholder>
@@ -10404,7 +10598,7 @@
         <w:tc>
           <w:tcPr>
             <w:tcW w:w="3600" w:type="dxa"/>
-            <w:shd w:val="clear" w:color="auto" w:fill="DCE6F1"/>
+            <w:shd w:val="clear" w:color="auto" w:fill="DCE6EA"/>
             <w:vAlign w:val="top"/>
           </w:tcPr>
           <w:p>
@@ -10414,6 +10608,7 @@
             <w:r>
               <w:rPr>
                 <w:b/>
+                <w:color w:val="003344"/>
                 <w:sz w:val="20"/>
                 <w:szCs w:val="20"/>
               </w:rPr>
@@ -10437,7 +10632,7 @@
                 </w:rPr>
                 <w:alias w:val="Strategies That Worked Well"/>
                 <w:tag w:val="Strategies That Worked Well"/>
-                <w:id w:val="1215"/>
+                <w:id w:val="1217"/>
                 <w:placeholder>
                   <w:docPart w:val="DefaultPlaceholder_-1854013440"/>
                 </w:placeholder>
@@ -10460,7 +10655,7 @@
         <w:tc>
           <w:tcPr>
             <w:tcW w:w="3600" w:type="dxa"/>
-            <w:shd w:val="clear" w:color="auto" w:fill="DCE6F1"/>
+            <w:shd w:val="clear" w:color="auto" w:fill="DCE6EA"/>
             <w:vAlign w:val="top"/>
           </w:tcPr>
           <w:p>
@@ -10470,6 +10665,7 @@
             <w:r>
               <w:rPr>
                 <w:b/>
+                <w:color w:val="003344"/>
                 <w:sz w:val="20"/>
                 <w:szCs w:val="20"/>
               </w:rPr>
@@ -10493,7 +10689,7 @@
                 </w:rPr>
                 <w:alias w:val="Goals Requiring Ongoing Focus"/>
                 <w:tag w:val="Goals Requiring Ongoing Focus"/>
-                <w:id w:val="1216"/>
+                <w:id w:val="1218"/>
                 <w:placeholder>
                   <w:docPart w:val="DefaultPlaceholder_-1854013440"/>
                 </w:placeholder>
@@ -10516,7 +10712,7 @@
         <w:tc>
           <w:tcPr>
             <w:tcW w:w="3600" w:type="dxa"/>
-            <w:shd w:val="clear" w:color="auto" w:fill="DCE6F1"/>
+            <w:shd w:val="clear" w:color="auto" w:fill="DCE6EA"/>
             <w:vAlign w:val="top"/>
           </w:tcPr>
           <w:p>
@@ -10526,6 +10722,7 @@
             <w:r>
               <w:rPr>
                 <w:b/>
+                <w:color w:val="003344"/>
                 <w:sz w:val="20"/>
                 <w:szCs w:val="20"/>
               </w:rPr>
@@ -10549,7 +10746,7 @@
                 </w:rPr>
                 <w:alias w:val="Support Services Required"/>
                 <w:tag w:val="Support Services Required"/>
-                <w:id w:val="1217"/>
+                <w:id w:val="1219"/>
                 <w:placeholder>
                   <w:docPart w:val="DefaultPlaceholder_-1854013440"/>
                 </w:placeholder>
@@ -10576,8 +10773,8 @@
     </w:p>
     <w:p>
       <w:pPr>
-        <w:shd w:val="clear" w:color="auto" w:fill="2E5A87"/>
-        <w:spacing w:before="120" w:after="60" w:line="240" w:lineRule="auto"/>
+        <w:shd w:val="clear" w:color="auto" w:fill="003344"/>
+        <w:spacing w:before="140" w:after="60" w:line="240" w:lineRule="auto"/>
       </w:pPr>
       <w:r>
         <w:rPr>
@@ -10626,7 +10823,7 @@
           </w:rPr>
           <w:alias w:val="Transition In: notes"/>
           <w:tag w:val="Transition In: notes"/>
-          <w:id w:val="1218"/>
+          <w:id w:val="1220"/>
           <w:placeholder>
             <w:docPart w:val="DefaultPlaceholder_-1854013440"/>
           </w:placeholder>
@@ -10680,7 +10877,7 @@
           </w:rPr>
           <w:alias w:val="Transition to Next Grade: notes"/>
           <w:tag w:val="Transition to Next Grade: notes"/>
-          <w:id w:val="1219"/>
+          <w:id w:val="1221"/>
           <w:placeholder>
             <w:docPart w:val="DefaultPlaceholder_-1854013440"/>
           </w:placeholder>
@@ -10734,7 +10931,7 @@
           </w:rPr>
           <w:alias w:val="Transition to Local School: notes"/>
           <w:tag w:val="Transition to Local School: notes"/>
-          <w:id w:val="1220"/>
+          <w:id w:val="1222"/>
           <w:placeholder>
             <w:docPart w:val="DefaultPlaceholder_-1854013440"/>
           </w:placeholder>
@@ -10753,8 +10950,8 @@
     </w:p>
     <w:p>
       <w:pPr>
-        <w:shd w:val="clear" w:color="auto" w:fill="2E5A87"/>
-        <w:spacing w:before="120" w:after="60" w:line="240" w:lineRule="auto"/>
+        <w:shd w:val="clear" w:color="auto" w:fill="003344"/>
+        <w:spacing w:before="140" w:after="60" w:line="240" w:lineRule="auto"/>
       </w:pPr>
       <w:r>
         <w:rPr>
@@ -10813,7 +11010,7 @@
         <w:tc>
           <w:tcPr>
             <w:tcW w:w="2400" w:type="dxa"/>
-            <w:shd w:val="clear" w:color="auto" w:fill="DCE6F1"/>
+            <w:shd w:val="clear" w:color="auto" w:fill="DCE6EA"/>
             <w:vAlign w:val="top"/>
           </w:tcPr>
           <w:p>
@@ -10823,6 +11020,7 @@
             <w:r>
               <w:rPr>
                 <w:b/>
+                <w:color w:val="003344"/>
                 <w:sz w:val="20"/>
                 <w:szCs w:val="20"/>
               </w:rPr>
@@ -10833,7 +11031,7 @@
         <w:tc>
           <w:tcPr>
             <w:tcW w:w="2600" w:type="dxa"/>
-            <w:shd w:val="clear" w:color="auto" w:fill="DCE6F1"/>
+            <w:shd w:val="clear" w:color="auto" w:fill="DCE6EA"/>
             <w:vAlign w:val="top"/>
           </w:tcPr>
           <w:p>
@@ -10843,6 +11041,7 @@
             <w:r>
               <w:rPr>
                 <w:b/>
+                <w:color w:val="003344"/>
                 <w:sz w:val="20"/>
                 <w:szCs w:val="20"/>
               </w:rPr>
@@ -10853,7 +11052,7 @@
         <w:tc>
           <w:tcPr>
             <w:tcW w:w="2040" w:type="dxa"/>
-            <w:shd w:val="clear" w:color="auto" w:fill="DCE6F1"/>
+            <w:shd w:val="clear" w:color="auto" w:fill="DCE6EA"/>
             <w:vAlign w:val="top"/>
           </w:tcPr>
           <w:p>
@@ -10863,6 +11062,7 @@
             <w:r>
               <w:rPr>
                 <w:b/>
+                <w:color w:val="003344"/>
                 <w:sz w:val="20"/>
                 <w:szCs w:val="20"/>
               </w:rPr>
@@ -10873,7 +11073,7 @@
         <w:tc>
           <w:tcPr>
             <w:tcW w:w="1520" w:type="dxa"/>
-            <w:shd w:val="clear" w:color="auto" w:fill="DCE6F1"/>
+            <w:shd w:val="clear" w:color="auto" w:fill="DCE6EA"/>
             <w:vAlign w:val="top"/>
           </w:tcPr>
           <w:p>
@@ -10883,6 +11083,7 @@
             <w:r>
               <w:rPr>
                 <w:b/>
+                <w:color w:val="003344"/>
                 <w:sz w:val="20"/>
                 <w:szCs w:val="20"/>
               </w:rPr>
@@ -10893,7 +11094,7 @@
         <w:tc>
           <w:tcPr>
             <w:tcW w:w="1520" w:type="dxa"/>
-            <w:shd w:val="clear" w:color="auto" w:fill="DCE6F1"/>
+            <w:shd w:val="clear" w:color="auto" w:fill="DCE6EA"/>
             <w:vAlign w:val="top"/>
           </w:tcPr>
           <w:p>
@@ -10903,6 +11104,7 @@
             <w:r>
               <w:rPr>
                 <w:b/>
+                <w:color w:val="003344"/>
                 <w:sz w:val="20"/>
                 <w:szCs w:val="20"/>
               </w:rPr>
@@ -10942,7 +11144,7 @@
                 </w:rPr>
                 <w:alias w:val="Name"/>
                 <w:tag w:val="Name"/>
-                <w:id w:val="1221"/>
+                <w:id w:val="1223"/>
                 <w:placeholder>
                   <w:docPart w:val="DefaultPlaceholder_-1854013440"/>
                 </w:placeholder>
@@ -10976,7 +11178,7 @@
                 </w:rPr>
                 <w:alias w:val="Signature"/>
                 <w:tag w:val="Signature"/>
-                <w:id w:val="1222"/>
+                <w:id w:val="1224"/>
                 <w:placeholder>
                   <w:docPart w:val="DefaultPlaceholder_-1854013440"/>
                 </w:placeholder>
@@ -11010,7 +11212,7 @@
                 </w:rPr>
                 <w:alias w:val="Date 1"/>
                 <w:tag w:val="Date 1"/>
-                <w:id w:val="1223"/>
+                <w:id w:val="1225"/>
                 <w:placeholder>
                   <w:docPart w:val="DefaultPlaceholder_-1854013440"/>
                 </w:placeholder>
@@ -11044,7 +11246,7 @@
                 </w:rPr>
                 <w:alias w:val="Date 2"/>
                 <w:tag w:val="Date 2"/>
-                <w:id w:val="1224"/>
+                <w:id w:val="1226"/>
                 <w:placeholder>
                   <w:docPart w:val="DefaultPlaceholder_-1854013440"/>
                 </w:placeholder>
@@ -11078,7 +11280,7 @@
                 </w:rPr>
                 <w:alias w:val="Date 3"/>
                 <w:tag w:val="Date 3"/>
-                <w:id w:val="1225"/>
+                <w:id w:val="1227"/>
                 <w:placeholder>
                   <w:docPart w:val="DefaultPlaceholder_-1854013440"/>
                 </w:placeholder>
@@ -11128,7 +11330,7 @@
                 </w:rPr>
                 <w:alias w:val="Name"/>
                 <w:tag w:val="Name"/>
-                <w:id w:val="1226"/>
+                <w:id w:val="1228"/>
                 <w:placeholder>
                   <w:docPart w:val="DefaultPlaceholder_-1854013440"/>
                 </w:placeholder>
@@ -11162,7 +11364,7 @@
                 </w:rPr>
                 <w:alias w:val="Signature"/>
                 <w:tag w:val="Signature"/>
-                <w:id w:val="1227"/>
+                <w:id w:val="1229"/>
                 <w:placeholder>
                   <w:docPart w:val="DefaultPlaceholder_-1854013440"/>
                 </w:placeholder>
@@ -11196,7 +11398,7 @@
                 </w:rPr>
                 <w:alias w:val="Date 1"/>
                 <w:tag w:val="Date 1"/>
-                <w:id w:val="1228"/>
+                <w:id w:val="1230"/>
                 <w:placeholder>
                   <w:docPart w:val="DefaultPlaceholder_-1854013440"/>
                 </w:placeholder>
@@ -11230,7 +11432,7 @@
                 </w:rPr>
                 <w:alias w:val="Date 2"/>
                 <w:tag w:val="Date 2"/>
-                <w:id w:val="1229"/>
+                <w:id w:val="1231"/>
                 <w:placeholder>
                   <w:docPart w:val="DefaultPlaceholder_-1854013440"/>
                 </w:placeholder>
@@ -11264,7 +11466,7 @@
                 </w:rPr>
                 <w:alias w:val="Date 3"/>
                 <w:tag w:val="Date 3"/>
-                <w:id w:val="1230"/>
+                <w:id w:val="1232"/>
                 <w:placeholder>
                   <w:docPart w:val="DefaultPlaceholder_-1854013440"/>
                 </w:placeholder>
@@ -11314,7 +11516,7 @@
                 </w:rPr>
                 <w:alias w:val="Name"/>
                 <w:tag w:val="Name"/>
-                <w:id w:val="1231"/>
+                <w:id w:val="1233"/>
                 <w:placeholder>
                   <w:docPart w:val="DefaultPlaceholder_-1854013440"/>
                 </w:placeholder>
@@ -11348,7 +11550,7 @@
                 </w:rPr>
                 <w:alias w:val="Signature"/>
                 <w:tag w:val="Signature"/>
-                <w:id w:val="1232"/>
+                <w:id w:val="1234"/>
                 <w:placeholder>
                   <w:docPart w:val="DefaultPlaceholder_-1854013440"/>
                 </w:placeholder>
@@ -11382,7 +11584,7 @@
                 </w:rPr>
                 <w:alias w:val="Date 1"/>
                 <w:tag w:val="Date 1"/>
-                <w:id w:val="1233"/>
+                <w:id w:val="1235"/>
                 <w:placeholder>
                   <w:docPart w:val="DefaultPlaceholder_-1854013440"/>
                 </w:placeholder>
@@ -11416,7 +11618,7 @@
                 </w:rPr>
                 <w:alias w:val="Date 2"/>
                 <w:tag w:val="Date 2"/>
-                <w:id w:val="1234"/>
+                <w:id w:val="1236"/>
                 <w:placeholder>
                   <w:docPart w:val="DefaultPlaceholder_-1854013440"/>
                 </w:placeholder>
@@ -11450,7 +11652,7 @@
                 </w:rPr>
                 <w:alias w:val="Date 3"/>
                 <w:tag w:val="Date 3"/>
-                <w:id w:val="1235"/>
+                <w:id w:val="1237"/>
                 <w:placeholder>
                   <w:docPart w:val="DefaultPlaceholder_-1854013440"/>
                 </w:placeholder>
@@ -11500,7 +11702,7 @@
                 </w:rPr>
                 <w:alias w:val="Name"/>
                 <w:tag w:val="Name"/>
-                <w:id w:val="1236"/>
+                <w:id w:val="1238"/>
                 <w:placeholder>
                   <w:docPart w:val="DefaultPlaceholder_-1854013440"/>
                 </w:placeholder>
@@ -11534,7 +11736,7 @@
                 </w:rPr>
                 <w:alias w:val="Signature"/>
                 <w:tag w:val="Signature"/>
-                <w:id w:val="1237"/>
+                <w:id w:val="1239"/>
                 <w:placeholder>
                   <w:docPart w:val="DefaultPlaceholder_-1854013440"/>
                 </w:placeholder>
@@ -11568,7 +11770,7 @@
                 </w:rPr>
                 <w:alias w:val="Date 1"/>
                 <w:tag w:val="Date 1"/>
-                <w:id w:val="1238"/>
+                <w:id w:val="1240"/>
                 <w:placeholder>
                   <w:docPart w:val="DefaultPlaceholder_-1854013440"/>
                 </w:placeholder>
@@ -11602,7 +11804,7 @@
                 </w:rPr>
                 <w:alias w:val="Date 2"/>
                 <w:tag w:val="Date 2"/>
-                <w:id w:val="1239"/>
+                <w:id w:val="1241"/>
                 <w:placeholder>
                   <w:docPart w:val="DefaultPlaceholder_-1854013440"/>
                 </w:placeholder>
@@ -11636,7 +11838,7 @@
                 </w:rPr>
                 <w:alias w:val="Date 3"/>
                 <w:tag w:val="Date 3"/>
-                <w:id w:val="1240"/>
+                <w:id w:val="1242"/>
                 <w:placeholder>
                   <w:docPart w:val="DefaultPlaceholder_-1854013440"/>
                 </w:placeholder>
@@ -11686,7 +11888,7 @@
                 </w:rPr>
                 <w:alias w:val="Name"/>
                 <w:tag w:val="Name"/>
-                <w:id w:val="1241"/>
+                <w:id w:val="1243"/>
                 <w:placeholder>
                   <w:docPart w:val="DefaultPlaceholder_-1854013440"/>
                 </w:placeholder>
@@ -11720,7 +11922,7 @@
                 </w:rPr>
                 <w:alias w:val="Signature"/>
                 <w:tag w:val="Signature"/>
-                <w:id w:val="1242"/>
+                <w:id w:val="1244"/>
                 <w:placeholder>
                   <w:docPart w:val="DefaultPlaceholder_-1854013440"/>
                 </w:placeholder>
@@ -11754,7 +11956,7 @@
                 </w:rPr>
                 <w:alias w:val="Date 1"/>
                 <w:tag w:val="Date 1"/>
-                <w:id w:val="1243"/>
+                <w:id w:val="1245"/>
                 <w:placeholder>
                   <w:docPart w:val="DefaultPlaceholder_-1854013440"/>
                 </w:placeholder>
@@ -11788,7 +11990,7 @@
                 </w:rPr>
                 <w:alias w:val="Date 2"/>
                 <w:tag w:val="Date 2"/>
-                <w:id w:val="1244"/>
+                <w:id w:val="1246"/>
                 <w:placeholder>
                   <w:docPart w:val="DefaultPlaceholder_-1854013440"/>
                 </w:placeholder>
@@ -11822,7 +12024,7 @@
                 </w:rPr>
                 <w:alias w:val="Date 3"/>
                 <w:tag w:val="Date 3"/>
-                <w:id w:val="1245"/>
+                <w:id w:val="1247"/>
                 <w:placeholder>
                   <w:docPart w:val="DefaultPlaceholder_-1854013440"/>
                 </w:placeholder>
@@ -11872,7 +12074,7 @@
                 </w:rPr>
                 <w:alias w:val="Name"/>
                 <w:tag w:val="Name"/>
-                <w:id w:val="1246"/>
+                <w:id w:val="1248"/>
                 <w:placeholder>
                   <w:docPart w:val="DefaultPlaceholder_-1854013440"/>
                 </w:placeholder>
@@ -11906,7 +12108,7 @@
                 </w:rPr>
                 <w:alias w:val="Signature"/>
                 <w:tag w:val="Signature"/>
-                <w:id w:val="1247"/>
+                <w:id w:val="1249"/>
                 <w:placeholder>
                   <w:docPart w:val="DefaultPlaceholder_-1854013440"/>
                 </w:placeholder>
@@ -11940,7 +12142,7 @@
                 </w:rPr>
                 <w:alias w:val="Date 1"/>
                 <w:tag w:val="Date 1"/>
-                <w:id w:val="1248"/>
+                <w:id w:val="1250"/>
                 <w:placeholder>
                   <w:docPart w:val="DefaultPlaceholder_-1854013440"/>
                 </w:placeholder>
@@ -11974,7 +12176,7 @@
                 </w:rPr>
                 <w:alias w:val="Date 2"/>
                 <w:tag w:val="Date 2"/>
-                <w:id w:val="1249"/>
+                <w:id w:val="1251"/>
                 <w:placeholder>
                   <w:docPart w:val="DefaultPlaceholder_-1854013440"/>
                 </w:placeholder>
@@ -12008,7 +12210,7 @@
                 </w:rPr>
                 <w:alias w:val="Date 3"/>
                 <w:tag w:val="Date 3"/>
-                <w:id w:val="1250"/>
+                <w:id w:val="1252"/>
                 <w:placeholder>
                   <w:docPart w:val="DefaultPlaceholder_-1854013440"/>
                 </w:placeholder>
@@ -12104,7 +12306,7 @@
         </w:rPr>
         <w:alias w:val="Term"/>
         <w:tag w:val="Term"/>
-        <w:id w:val="1251"/>
+        <w:id w:val="1253"/>
         <w:placeholder>
           <w:docPart w:val="DefaultPlaceholder_-1854013440"/>
         </w:placeholder>
@@ -12135,7 +12337,7 @@
         </w:rPr>
         <w:alias w:val="ASN Header"/>
         <w:tag w:val="ASN Header"/>
-        <w:id w:val="1252"/>
+        <w:id w:val="1254"/>
         <w:placeholder>
           <w:docPart w:val="DefaultPlaceholder_-1854013440"/>
         </w:placeholder>
@@ -12166,7 +12368,7 @@
         </w:rPr>
         <w:alias w:val="Student Name Header"/>
         <w:tag w:val="Student Name Header"/>
-        <w:id w:val="1253"/>
+        <w:id w:val="1255"/>
         <w:placeholder>
           <w:docPart w:val="DefaultPlaceholder_-1854013440"/>
         </w:placeholder>
@@ -12197,7 +12399,7 @@
         </w:rPr>
         <w:alias w:val="Student Number"/>
         <w:tag w:val="Student Number"/>
-        <w:id w:val="1254"/>
+        <w:id w:val="1256"/>
         <w:placeholder>
           <w:docPart w:val="DefaultPlaceholder_-1854013440"/>
         </w:placeholder>

</xml_diff>